<commit_message>
9Jul2025: Updated Docker quiz
</commit_message>
<xml_diff>
--- a/Docker_Quick_Quiz.docx
+++ b/Docker_Quick_Quiz.docx
@@ -58,7 +58,7 @@
           <w:color w:val="1B1C1D"/>
         </w:rPr>
         <w:pict w14:anchorId="7BDBF6E2">
-          <v:rect id="_x0000_i1027" alt="" style="width:451.3pt;height:.05pt;mso-width-percent:0;mso-height-percent:0;mso-width-percent:0;mso-height-percent:0" o:hralign="center" o:hrstd="t" o:hrnoshade="t" o:hr="t" fillcolor="#1b1c1d" stroked="f"/>
+          <v:rect id="_x0000_i1029" alt="" style="width:451.3pt;height:.05pt;mso-width-percent:0;mso-height-percent:0;mso-width-percent:0;mso-height-percent:0" o:hralign="center" o:hrstd="t" o:hrnoshade="t" o:hr="t" fillcolor="#1b1c1d" stroked="f"/>
         </w:pict>
       </w:r>
     </w:p>
@@ -207,7 +207,7 @@
           <w:color w:val="1B1C1D"/>
         </w:rPr>
         <w:pict w14:anchorId="409B46DE">
-          <v:rect id="_x0000_i1026" alt="" style="width:451.3pt;height:.05pt;mso-width-percent:0;mso-height-percent:0;mso-width-percent:0;mso-height-percent:0" o:hralign="center" o:hrstd="t" o:hrnoshade="t" o:hr="t" fillcolor="#1b1c1d" stroked="f"/>
+          <v:rect id="_x0000_i1028" alt="" style="width:451.3pt;height:.05pt;mso-width-percent:0;mso-height-percent:0;mso-width-percent:0;mso-height-percent:0" o:hralign="center" o:hrstd="t" o:hrnoshade="t" o:hr="t" fillcolor="#1b1c1d" stroked="f"/>
         </w:pict>
       </w:r>
     </w:p>
@@ -563,7 +563,7 @@
           <w:color w:val="1B1C1D"/>
         </w:rPr>
         <w:pict w14:anchorId="1FFA9BC6">
-          <v:rect id="_x0000_i1025" alt="" style="width:451.3pt;height:.05pt;mso-width-percent:0;mso-height-percent:0;mso-width-percent:0;mso-height-percent:0" o:hralign="center" o:hrstd="t" o:hrnoshade="t" o:hr="t" fillcolor="#1b1c1d" stroked="f"/>
+          <v:rect id="_x0000_i1027" alt="" style="width:451.3pt;height:.05pt;mso-width-percent:0;mso-height-percent:0;mso-width-percent:0;mso-height-percent:0" o:hralign="center" o:hrstd="t" o:hrnoshade="t" o:hr="t" fillcolor="#1b1c1d" stroked="f"/>
         </w:pict>
       </w:r>
     </w:p>
@@ -801,6 +801,811 @@
           <w:color w:val="1B1C1D"/>
         </w:rPr>
         <w:t xml:space="preserve"> file.</w:t>
+      </w:r>
+    </w:p>
+    <w:p>
+      <w:pPr>
+        <w:pStyle w:val="NormalWeb"/>
+        <w:spacing w:before="0" w:beforeAutospacing="0" w:after="0" w:afterAutospacing="0"/>
+        <w:rPr>
+          <w:rFonts w:ascii="Google Sans Text" w:hAnsi="Google Sans Text"/>
+          <w:color w:val="1B1C1D"/>
+        </w:rPr>
+      </w:pPr>
+    </w:p>
+    <w:p>
+      <w:pPr>
+        <w:pStyle w:val="NormalWeb"/>
+      </w:pPr>
+      <w:r>
+        <w:lastRenderedPageBreak/>
+        <w:t>Question 4:</w:t>
+      </w:r>
+    </w:p>
+    <w:p>
+      <w:pPr>
+        <w:pStyle w:val="NormalWeb"/>
+      </w:pPr>
+      <w:r>
+        <w:t xml:space="preserve">The correct </w:t>
+      </w:r>
+      <w:proofErr w:type="spellStart"/>
+      <w:r>
+        <w:t>Dockerfile</w:t>
+      </w:r>
+      <w:proofErr w:type="spellEnd"/>
+      <w:r>
+        <w:t xml:space="preserve"> instruction is </w:t>
+      </w:r>
+      <w:r>
+        <w:rPr>
+          <w:rStyle w:val="HTMLCode"/>
+          <w:b/>
+          <w:bCs/>
+        </w:rPr>
+        <w:t>HEALTHCHECK</w:t>
+      </w:r>
+      <w:r>
+        <w:t>.</w:t>
+      </w:r>
+    </w:p>
+    <w:p>
+      <w:r>
+        <w:rPr>
+          <w:noProof/>
+        </w:rPr>
+        <w:pict w14:anchorId="62F5582A">
+          <v:rect id="_x0000_i1026" alt="" style="width:451.3pt;height:.05pt;mso-width-percent:0;mso-height-percent:0;mso-width-percent:0;mso-height-percent:0" o:hralign="center" o:hrstd="t" o:hr="t" fillcolor="#a0a0a0" stroked="f"/>
+        </w:pict>
+      </w:r>
+    </w:p>
+    <w:p>
+      <w:pPr>
+        <w:pStyle w:val="Heading3"/>
+      </w:pPr>
+      <w:r>
+        <w:t>Explanation</w:t>
+      </w:r>
+    </w:p>
+    <w:p>
+      <w:pPr>
+        <w:pStyle w:val="NormalWeb"/>
+      </w:pPr>
+      <w:r>
+        <w:t xml:space="preserve">The </w:t>
+      </w:r>
+      <w:r>
+        <w:rPr>
+          <w:rStyle w:val="HTMLCode"/>
+        </w:rPr>
+        <w:t>HEALTHCHECK</w:t>
+      </w:r>
+      <w:r>
+        <w:t xml:space="preserve"> instruction tells Docker how to test a container to check that it's still working properly. You provide a command that Docker will run periodically inside the container. Based on the exit code of this command, Docker determines the container's health status as either </w:t>
+      </w:r>
+      <w:r>
+        <w:rPr>
+          <w:rStyle w:val="HTMLCode"/>
+        </w:rPr>
+        <w:t>starting</w:t>
+      </w:r>
+      <w:r>
+        <w:t xml:space="preserve">, </w:t>
+      </w:r>
+      <w:r>
+        <w:rPr>
+          <w:rStyle w:val="HTMLCode"/>
+        </w:rPr>
+        <w:t>healthy</w:t>
+      </w:r>
+      <w:r>
+        <w:t xml:space="preserve">, or </w:t>
+      </w:r>
+      <w:r>
+        <w:rPr>
+          <w:rStyle w:val="HTMLCode"/>
+        </w:rPr>
+        <w:t>unhealthy</w:t>
+      </w:r>
+      <w:r>
+        <w:t>.</w:t>
+      </w:r>
+    </w:p>
+    <w:p>
+      <w:pPr>
+        <w:pStyle w:val="NormalWeb"/>
+      </w:pPr>
+      <w:r>
+        <w:rPr>
+          <w:b/>
+          <w:bCs/>
+        </w:rPr>
+        <w:t>Example:</w:t>
+      </w:r>
+      <w:r>
+        <w:t xml:space="preserve"> This command checks if a web server inside the container is responding successfully every 5 minutes.</w:t>
+      </w:r>
+    </w:p>
+    <w:p>
+      <w:proofErr w:type="spellStart"/>
+      <w:r>
+        <w:rPr>
+          <w:rStyle w:val="ng-tns-c2709846391-111"/>
+        </w:rPr>
+        <w:t>Dockerfile</w:t>
+      </w:r>
+      <w:proofErr w:type="spellEnd"/>
+    </w:p>
+    <w:p>
+      <w:pPr>
+        <w:pStyle w:val="HTMLPreformatted"/>
+        <w:rPr>
+          <w:rStyle w:val="bash"/>
+        </w:rPr>
+      </w:pPr>
+      <w:r>
+        <w:rPr>
+          <w:rStyle w:val="hljs-keyword"/>
+        </w:rPr>
+        <w:t>HEALTHCHECK</w:t>
+      </w:r>
+      <w:r>
+        <w:rPr>
+          <w:rStyle w:val="bash"/>
+        </w:rPr>
+        <w:t xml:space="preserve"> --interval=5m --timeout=3s \</w:t>
+      </w:r>
+    </w:p>
+    <w:p>
+      <w:pPr>
+        <w:pStyle w:val="HTMLPreformatted"/>
+        <w:rPr>
+          <w:rStyle w:val="HTMLCode"/>
+        </w:rPr>
+      </w:pPr>
+      <w:r>
+        <w:rPr>
+          <w:rStyle w:val="bash"/>
+        </w:rPr>
+        <w:t xml:space="preserve">  CMD curl -f http://localhost/ || </w:t>
+      </w:r>
+      <w:r>
+        <w:rPr>
+          <w:rStyle w:val="hljs-builtin"/>
+        </w:rPr>
+        <w:t>exit</w:t>
+      </w:r>
+      <w:r>
+        <w:rPr>
+          <w:rStyle w:val="bash"/>
+        </w:rPr>
+        <w:t xml:space="preserve"> 1</w:t>
+      </w:r>
+    </w:p>
+    <w:p>
+      <w:pPr>
+        <w:pStyle w:val="Heading3"/>
+      </w:pPr>
+      <w:r>
+        <w:t>Other Options</w:t>
+      </w:r>
+    </w:p>
+    <w:p>
+      <w:pPr>
+        <w:pStyle w:val="NormalWeb"/>
+        <w:numPr>
+          <w:ilvl w:val="0"/>
+          <w:numId w:val="17"/>
+        </w:numPr>
+      </w:pPr>
+      <w:r>
+        <w:rPr>
+          <w:rStyle w:val="HTMLCode"/>
+          <w:b/>
+          <w:bCs/>
+        </w:rPr>
+        <w:t>LIVENESSPROBE</w:t>
+      </w:r>
+      <w:r>
+        <w:t xml:space="preserve">: This is a concept from Kubernetes, not a </w:t>
+      </w:r>
+      <w:proofErr w:type="spellStart"/>
+      <w:r>
+        <w:t>Dockerfile</w:t>
+      </w:r>
+      <w:proofErr w:type="spellEnd"/>
+      <w:r>
+        <w:t xml:space="preserve"> instruction. It serves a similar purpose but in a different ecosystem.</w:t>
+      </w:r>
+    </w:p>
+    <w:p>
+      <w:pPr>
+        <w:pStyle w:val="NormalWeb"/>
+        <w:numPr>
+          <w:ilvl w:val="0"/>
+          <w:numId w:val="17"/>
+        </w:numPr>
+      </w:pPr>
+      <w:r>
+        <w:rPr>
+          <w:rStyle w:val="HTMLCode"/>
+          <w:b/>
+          <w:bCs/>
+        </w:rPr>
+        <w:t>STOPSIGNAL</w:t>
+      </w:r>
+      <w:r>
+        <w:t xml:space="preserve">, </w:t>
+      </w:r>
+      <w:r>
+        <w:rPr>
+          <w:rStyle w:val="HTMLCode"/>
+          <w:b/>
+          <w:bCs/>
+        </w:rPr>
+        <w:t>PROBE</w:t>
+      </w:r>
+      <w:r>
+        <w:t xml:space="preserve">, and </w:t>
+      </w:r>
+      <w:r>
+        <w:rPr>
+          <w:rStyle w:val="HTMLCode"/>
+          <w:b/>
+          <w:bCs/>
+        </w:rPr>
+        <w:t>TEST</w:t>
+      </w:r>
+      <w:r>
+        <w:t xml:space="preserve">: These are not valid </w:t>
+      </w:r>
+      <w:proofErr w:type="spellStart"/>
+      <w:r>
+        <w:t>Dockerfile</w:t>
+      </w:r>
+      <w:proofErr w:type="spellEnd"/>
+      <w:r>
+        <w:t xml:space="preserve"> instructions for checking a container's health.</w:t>
+      </w:r>
+    </w:p>
+    <w:p>
+      <w:pPr>
+        <w:pStyle w:val="Heading3"/>
+      </w:pPr>
+      <w:r>
+        <w:t>Attaching a mount / persistent disk space for Docker</w:t>
+      </w:r>
+    </w:p>
+    <w:p>
+      <w:pPr>
+        <w:pStyle w:val="Heading3"/>
+      </w:pPr>
+      <w:r>
+        <w:t>Explanation</w:t>
+      </w:r>
+    </w:p>
+    <w:p>
+      <w:pPr>
+        <w:pStyle w:val="NormalWeb"/>
+      </w:pPr>
+      <w:r>
+        <w:t xml:space="preserve">When using the </w:t>
+      </w:r>
+      <w:r>
+        <w:rPr>
+          <w:rStyle w:val="HTMLCode"/>
+        </w:rPr>
+        <w:t>--mount</w:t>
+      </w:r>
+      <w:r>
+        <w:t xml:space="preserve"> flag in a </w:t>
+      </w:r>
+      <w:r>
+        <w:rPr>
+          <w:rStyle w:val="HTMLCode"/>
+        </w:rPr>
+        <w:t>docker run</w:t>
+      </w:r>
+      <w:r>
+        <w:t xml:space="preserve"> command, you specify options as a series of key-value pairs separated by commas. To mount a volume as read-only, you must add the </w:t>
+      </w:r>
+      <w:proofErr w:type="spellStart"/>
+      <w:r>
+        <w:rPr>
+          <w:rStyle w:val="HTMLCode"/>
+        </w:rPr>
+        <w:t>readonly</w:t>
+      </w:r>
+      <w:proofErr w:type="spellEnd"/>
+      <w:r>
+        <w:t xml:space="preserve"> key.</w:t>
+      </w:r>
+    </w:p>
+    <w:p>
+      <w:pPr>
+        <w:pStyle w:val="Heading3"/>
+      </w:pPr>
+      <w:r>
+        <w:t>Analysis of the Options</w:t>
+      </w:r>
+    </w:p>
+    <w:p>
+      <w:pPr>
+        <w:pStyle w:val="NormalWeb"/>
+        <w:numPr>
+          <w:ilvl w:val="0"/>
+          <w:numId w:val="18"/>
+        </w:numPr>
+      </w:pPr>
+      <w:r>
+        <w:rPr>
+          <w:rStyle w:val="HTMLCode"/>
+          <w:b/>
+          <w:bCs/>
+        </w:rPr>
+        <w:t>docker run --mount source=nginx-</w:t>
+      </w:r>
+      <w:proofErr w:type="spellStart"/>
+      <w:r>
+        <w:rPr>
+          <w:rStyle w:val="HTMLCode"/>
+          <w:b/>
+          <w:bCs/>
+        </w:rPr>
+        <w:t>vol,destination</w:t>
+      </w:r>
+      <w:proofErr w:type="spellEnd"/>
+      <w:r>
+        <w:rPr>
+          <w:rStyle w:val="HTMLCode"/>
+          <w:b/>
+          <w:bCs/>
+        </w:rPr>
+        <w:t>=/var/www/</w:t>
+      </w:r>
+      <w:proofErr w:type="spellStart"/>
+      <w:r>
+        <w:rPr>
+          <w:rStyle w:val="HTMLCode"/>
+          <w:b/>
+          <w:bCs/>
+        </w:rPr>
+        <w:t>html,readonly</w:t>
+      </w:r>
+      <w:proofErr w:type="spellEnd"/>
+      <w:r>
+        <w:rPr>
+          <w:rStyle w:val="HTMLCode"/>
+          <w:b/>
+          <w:bCs/>
+        </w:rPr>
+        <w:t xml:space="preserve"> nginx</w:t>
+      </w:r>
+      <w:r>
+        <w:rPr>
+          <w:b/>
+          <w:bCs/>
+        </w:rPr>
+        <w:t xml:space="preserve"> (Correct) </w:t>
+      </w:r>
+      <w:r>
+        <w:rPr>
+          <w:rFonts w:ascii="Apple Color Emoji" w:hAnsi="Apple Color Emoji" w:cs="Apple Color Emoji"/>
+          <w:b/>
+          <w:bCs/>
+        </w:rPr>
+        <w:t>✅</w:t>
+      </w:r>
+    </w:p>
+    <w:p>
+      <w:pPr>
+        <w:pStyle w:val="NormalWeb"/>
+        <w:numPr>
+          <w:ilvl w:val="1"/>
+          <w:numId w:val="18"/>
+        </w:numPr>
+      </w:pPr>
+      <w:r>
+        <w:t xml:space="preserve">This command correctly uses the </w:t>
+      </w:r>
+      <w:r>
+        <w:rPr>
+          <w:rStyle w:val="HTMLCode"/>
+        </w:rPr>
+        <w:t>--mount</w:t>
+      </w:r>
+      <w:r>
+        <w:t xml:space="preserve"> flag with comma-separated key-value pairs: </w:t>
+      </w:r>
+      <w:r>
+        <w:rPr>
+          <w:rStyle w:val="HTMLCode"/>
+        </w:rPr>
+        <w:t>source</w:t>
+      </w:r>
+      <w:r>
+        <w:t xml:space="preserve">, </w:t>
+      </w:r>
+      <w:r>
+        <w:rPr>
+          <w:rStyle w:val="HTMLCode"/>
+        </w:rPr>
+        <w:t>destination</w:t>
+      </w:r>
+      <w:r>
+        <w:t xml:space="preserve">, and the standalone </w:t>
+      </w:r>
+      <w:proofErr w:type="spellStart"/>
+      <w:r>
+        <w:rPr>
+          <w:rStyle w:val="HTMLCode"/>
+        </w:rPr>
+        <w:t>readonly</w:t>
+      </w:r>
+      <w:proofErr w:type="spellEnd"/>
+      <w:r>
+        <w:t xml:space="preserve"> key to specify the mode.</w:t>
+      </w:r>
+    </w:p>
+    <w:p>
+      <w:pPr>
+        <w:pStyle w:val="NormalWeb"/>
+        <w:numPr>
+          <w:ilvl w:val="0"/>
+          <w:numId w:val="18"/>
+        </w:numPr>
+      </w:pPr>
+      <w:r>
+        <w:rPr>
+          <w:rStyle w:val="HTMLCode"/>
+          <w:b/>
+          <w:bCs/>
+        </w:rPr>
+        <w:t>docker run --mount source=nginx-</w:t>
+      </w:r>
+      <w:proofErr w:type="spellStart"/>
+      <w:r>
+        <w:rPr>
+          <w:rStyle w:val="HTMLCode"/>
+          <w:b/>
+          <w:bCs/>
+        </w:rPr>
+        <w:t>vol,destination</w:t>
+      </w:r>
+      <w:proofErr w:type="spellEnd"/>
+      <w:r>
+        <w:rPr>
+          <w:rStyle w:val="HTMLCode"/>
+          <w:b/>
+          <w:bCs/>
+        </w:rPr>
+        <w:t>=/var/www/html --read-only nginx</w:t>
+      </w:r>
+    </w:p>
+    <w:p>
+      <w:pPr>
+        <w:pStyle w:val="NormalWeb"/>
+        <w:numPr>
+          <w:ilvl w:val="1"/>
+          <w:numId w:val="18"/>
+        </w:numPr>
+      </w:pPr>
+      <w:r>
+        <w:t xml:space="preserve">This is incorrect. </w:t>
+      </w:r>
+      <w:r>
+        <w:rPr>
+          <w:rStyle w:val="HTMLCode"/>
+        </w:rPr>
+        <w:t>--read-only</w:t>
+      </w:r>
+      <w:r>
+        <w:t xml:space="preserve"> is a separate, standalone flag for the </w:t>
+      </w:r>
+      <w:r>
+        <w:rPr>
+          <w:rStyle w:val="HTMLCode"/>
+        </w:rPr>
+        <w:t>docker run</w:t>
+      </w:r>
+      <w:r>
+        <w:t xml:space="preserve"> command itself, but it makes the container's entire filesystem read-only, not just a </w:t>
+      </w:r>
+      <w:r>
+        <w:lastRenderedPageBreak/>
+        <w:t xml:space="preserve">specific mount. The question asks to mount a single volume as read-only using </w:t>
+      </w:r>
+      <w:r>
+        <w:rPr>
+          <w:rStyle w:val="HTMLCode"/>
+        </w:rPr>
+        <w:t>--mount</w:t>
+      </w:r>
+      <w:r>
+        <w:t>.</w:t>
+      </w:r>
+    </w:p>
+    <w:p>
+      <w:pPr>
+        <w:pStyle w:val="NormalWeb"/>
+        <w:numPr>
+          <w:ilvl w:val="0"/>
+          <w:numId w:val="18"/>
+        </w:numPr>
+      </w:pPr>
+      <w:r>
+        <w:rPr>
+          <w:rStyle w:val="HTMLCode"/>
+          <w:b/>
+          <w:bCs/>
+        </w:rPr>
+        <w:t>docker run --mount source=nginx-</w:t>
+      </w:r>
+      <w:proofErr w:type="spellStart"/>
+      <w:r>
+        <w:rPr>
+          <w:rStyle w:val="HTMLCode"/>
+          <w:b/>
+          <w:bCs/>
+        </w:rPr>
+        <w:t>vol,destination</w:t>
+      </w:r>
+      <w:proofErr w:type="spellEnd"/>
+      <w:r>
+        <w:rPr>
+          <w:rStyle w:val="HTMLCode"/>
+          <w:b/>
+          <w:bCs/>
+        </w:rPr>
+        <w:t>=/var/www/</w:t>
+      </w:r>
+      <w:proofErr w:type="spellStart"/>
+      <w:r>
+        <w:rPr>
+          <w:rStyle w:val="HTMLCode"/>
+          <w:b/>
+          <w:bCs/>
+        </w:rPr>
+        <w:t>html,write</w:t>
+      </w:r>
+      <w:proofErr w:type="spellEnd"/>
+      <w:r>
+        <w:rPr>
+          <w:rStyle w:val="HTMLCode"/>
+          <w:b/>
+          <w:bCs/>
+        </w:rPr>
+        <w:t xml:space="preserve"> nginx</w:t>
+      </w:r>
+    </w:p>
+    <w:p>
+      <w:pPr>
+        <w:pStyle w:val="NormalWeb"/>
+        <w:numPr>
+          <w:ilvl w:val="1"/>
+          <w:numId w:val="18"/>
+        </w:numPr>
+      </w:pPr>
+      <w:r>
+        <w:t xml:space="preserve">This is incorrect. </w:t>
+      </w:r>
+      <w:r>
+        <w:rPr>
+          <w:rStyle w:val="HTMLCode"/>
+        </w:rPr>
+        <w:t>write</w:t>
+      </w:r>
+      <w:r>
+        <w:t xml:space="preserve"> is not a valid option for the </w:t>
+      </w:r>
+      <w:r>
+        <w:rPr>
+          <w:rStyle w:val="HTMLCode"/>
+        </w:rPr>
+        <w:t>--mount</w:t>
+      </w:r>
+      <w:r>
+        <w:t xml:space="preserve"> flag's mode. The default is read-write.</w:t>
+      </w:r>
+    </w:p>
+    <w:p>
+      <w:pPr>
+        <w:pStyle w:val="NormalWeb"/>
+        <w:numPr>
+          <w:ilvl w:val="0"/>
+          <w:numId w:val="18"/>
+        </w:numPr>
+      </w:pPr>
+      <w:r>
+        <w:rPr>
+          <w:rStyle w:val="HTMLCode"/>
+          <w:b/>
+          <w:bCs/>
+        </w:rPr>
+        <w:t>docker run --mount source=nginx-</w:t>
+      </w:r>
+      <w:proofErr w:type="spellStart"/>
+      <w:r>
+        <w:rPr>
+          <w:rStyle w:val="HTMLCode"/>
+          <w:b/>
+          <w:bCs/>
+        </w:rPr>
+        <w:t>vol,destination</w:t>
+      </w:r>
+      <w:proofErr w:type="spellEnd"/>
+      <w:r>
+        <w:rPr>
+          <w:rStyle w:val="HTMLCode"/>
+          <w:b/>
+          <w:bCs/>
+        </w:rPr>
+        <w:t>=/var/www/html --no-write nginx</w:t>
+      </w:r>
+    </w:p>
+    <w:p>
+      <w:pPr>
+        <w:pStyle w:val="NormalWeb"/>
+        <w:numPr>
+          <w:ilvl w:val="1"/>
+          <w:numId w:val="18"/>
+        </w:numPr>
+      </w:pPr>
+      <w:r>
+        <w:t xml:space="preserve">This is incorrect. </w:t>
+      </w:r>
+      <w:r>
+        <w:rPr>
+          <w:rStyle w:val="HTMLCode"/>
+        </w:rPr>
+        <w:t>--no-write</w:t>
+      </w:r>
+      <w:r>
+        <w:t xml:space="preserve"> is not a valid flag or option.</w:t>
+      </w:r>
+    </w:p>
+    <w:p>
+      <w:pPr>
+        <w:pStyle w:val="NormalWeb"/>
+        <w:numPr>
+          <w:ilvl w:val="0"/>
+          <w:numId w:val="18"/>
+        </w:numPr>
+      </w:pPr>
+      <w:r>
+        <w:rPr>
+          <w:rStyle w:val="HTMLCode"/>
+          <w:b/>
+          <w:bCs/>
+        </w:rPr>
+        <w:t>docker run --mount source=nginx-</w:t>
+      </w:r>
+      <w:proofErr w:type="spellStart"/>
+      <w:r>
+        <w:rPr>
+          <w:rStyle w:val="HTMLCode"/>
+          <w:b/>
+          <w:bCs/>
+        </w:rPr>
+        <w:t>vol,destination</w:t>
+      </w:r>
+      <w:proofErr w:type="spellEnd"/>
+      <w:r>
+        <w:rPr>
+          <w:rStyle w:val="HTMLCode"/>
+          <w:b/>
+          <w:bCs/>
+        </w:rPr>
+        <w:t>=/var/www/html -</w:t>
+      </w:r>
+      <w:proofErr w:type="spellStart"/>
+      <w:r>
+        <w:rPr>
+          <w:rStyle w:val="HTMLCode"/>
+          <w:b/>
+          <w:bCs/>
+        </w:rPr>
+        <w:t>ro</w:t>
+      </w:r>
+      <w:proofErr w:type="spellEnd"/>
+      <w:r>
+        <w:rPr>
+          <w:rStyle w:val="HTMLCode"/>
+          <w:b/>
+          <w:bCs/>
+        </w:rPr>
+        <w:t xml:space="preserve"> nginx</w:t>
+      </w:r>
+    </w:p>
+    <w:p>
+      <w:pPr>
+        <w:pStyle w:val="NormalWeb"/>
+        <w:numPr>
+          <w:ilvl w:val="1"/>
+          <w:numId w:val="18"/>
+        </w:numPr>
+      </w:pPr>
+      <w:r>
+        <w:t xml:space="preserve">This is incorrect. </w:t>
+      </w:r>
+      <w:r>
+        <w:rPr>
+          <w:rStyle w:val="HTMLCode"/>
+        </w:rPr>
+        <w:t>-</w:t>
+      </w:r>
+      <w:proofErr w:type="spellStart"/>
+      <w:r>
+        <w:rPr>
+          <w:rStyle w:val="HTMLCode"/>
+        </w:rPr>
+        <w:t>ro</w:t>
+      </w:r>
+      <w:proofErr w:type="spellEnd"/>
+      <w:r>
+        <w:t xml:space="preserve"> is not a valid flag for </w:t>
+      </w:r>
+      <w:r>
+        <w:rPr>
+          <w:rStyle w:val="HTMLCode"/>
+        </w:rPr>
+        <w:t>docker run</w:t>
+      </w:r>
+      <w:r>
+        <w:t xml:space="preserve">, and it's not the correct way to specify the read-only option within the </w:t>
+      </w:r>
+      <w:r>
+        <w:rPr>
+          <w:rStyle w:val="HTMLCode"/>
+        </w:rPr>
+        <w:t>--mount</w:t>
+      </w:r>
+      <w:r>
+        <w:t xml:space="preserve"> string. The shorthand </w:t>
+      </w:r>
+      <w:r>
+        <w:rPr>
+          <w:rStyle w:val="HTMLCode"/>
+        </w:rPr>
+        <w:t>:</w:t>
+      </w:r>
+      <w:proofErr w:type="spellStart"/>
+      <w:r>
+        <w:rPr>
+          <w:rStyle w:val="HTMLCode"/>
+        </w:rPr>
+        <w:t>ro</w:t>
+      </w:r>
+      <w:proofErr w:type="spellEnd"/>
+      <w:r>
+        <w:t xml:space="preserve"> is used with the older </w:t>
+      </w:r>
+      <w:r>
+        <w:rPr>
+          <w:rStyle w:val="HTMLCode"/>
+        </w:rPr>
+        <w:t>--volume</w:t>
+      </w:r>
+      <w:r>
+        <w:t xml:space="preserve"> (</w:t>
+      </w:r>
+      <w:r>
+        <w:rPr>
+          <w:rStyle w:val="HTMLCode"/>
+        </w:rPr>
+        <w:t>-v</w:t>
+      </w:r>
+      <w:r>
+        <w:t xml:space="preserve">) flag, not </w:t>
+      </w:r>
+      <w:r>
+        <w:rPr>
+          <w:rStyle w:val="HTMLCode"/>
+        </w:rPr>
+        <w:t>--mount</w:t>
+      </w:r>
+      <w:r>
+        <w:t>.</w:t>
       </w:r>
     </w:p>
     <w:p>
@@ -819,6 +1624,1047 @@
         </w:rPr>
       </w:pPr>
     </w:p>
+    <w:p>
+      <w:pPr>
+        <w:pStyle w:val="Heading3"/>
+      </w:pPr>
+      <w:r>
+        <w:t>Login to Docker registry</w:t>
+      </w:r>
+    </w:p>
+    <w:p>
+      <w:pPr>
+        <w:pStyle w:val="Heading3"/>
+      </w:pPr>
+      <w:r>
+        <w:t>Explanation</w:t>
+      </w:r>
+    </w:p>
+    <w:p>
+      <w:pPr>
+        <w:pStyle w:val="NormalWeb"/>
+      </w:pPr>
+      <w:r>
+        <w:t xml:space="preserve">To log in to a specific Docker registry, you need to provide the server's address. If you don't specify a server, Docker defaults to Docker Hub. The </w:t>
+      </w:r>
+      <w:r>
+        <w:rPr>
+          <w:rStyle w:val="HTMLCode"/>
+        </w:rPr>
+        <w:t>--username</w:t>
+      </w:r>
+      <w:r>
+        <w:t xml:space="preserve"> flag (or </w:t>
+      </w:r>
+      <w:r>
+        <w:rPr>
+          <w:rStyle w:val="HTMLCode"/>
+        </w:rPr>
+        <w:t>-u</w:t>
+      </w:r>
+      <w:r>
+        <w:t>) is used to specify the user.</w:t>
+      </w:r>
+    </w:p>
+    <w:p>
+      <w:pPr>
+        <w:pStyle w:val="Heading3"/>
+      </w:pPr>
+      <w:r>
+        <w:t>Analysis of Options</w:t>
+      </w:r>
+    </w:p>
+    <w:p>
+      <w:pPr>
+        <w:pStyle w:val="NormalWeb"/>
+        <w:numPr>
+          <w:ilvl w:val="0"/>
+          <w:numId w:val="20"/>
+        </w:numPr>
+      </w:pPr>
+      <w:r>
+        <w:rPr>
+          <w:rStyle w:val="HTMLCode"/>
+          <w:b/>
+          <w:bCs/>
+        </w:rPr>
+        <w:t>docker login --username=jerry docker-registry.company.com</w:t>
+      </w:r>
+      <w:r>
+        <w:t xml:space="preserve"> This is close, but the command expects the server URL to be explicitly provided as an argument, and modern syntax often uses a dedicated flag. While older versions might have accepted this, it's not the most precise syntax.</w:t>
+      </w:r>
+    </w:p>
+    <w:p>
+      <w:pPr>
+        <w:pStyle w:val="NormalWeb"/>
+        <w:numPr>
+          <w:ilvl w:val="0"/>
+          <w:numId w:val="20"/>
+        </w:numPr>
+      </w:pPr>
+      <w:r>
+        <w:rPr>
+          <w:rStyle w:val="HTMLCode"/>
+          <w:b/>
+          <w:bCs/>
+        </w:rPr>
+        <w:t>docker login --username=jerry --serverurl=docker-registry.company.com</w:t>
+      </w:r>
+      <w:r>
+        <w:t xml:space="preserve"> This is the most explicit and correct syntax, clearly defining both the username and the server URL with their respective flags. </w:t>
+      </w:r>
+      <w:r>
+        <w:rPr>
+          <w:b/>
+          <w:bCs/>
+        </w:rPr>
+        <w:t>This is the correct answer.</w:t>
+      </w:r>
+    </w:p>
+    <w:p>
+      <w:pPr>
+        <w:pStyle w:val="NormalWeb"/>
+        <w:numPr>
+          <w:ilvl w:val="0"/>
+          <w:numId w:val="20"/>
+        </w:numPr>
+      </w:pPr>
+      <w:r>
+        <w:rPr>
+          <w:rStyle w:val="HTMLCode"/>
+          <w:b/>
+          <w:bCs/>
+        </w:rPr>
+        <w:t>docker login -u jerry -h docker-registry.company.com</w:t>
+      </w:r>
+      <w:r>
+        <w:t xml:space="preserve"> This is incorrect. The </w:t>
+      </w:r>
+      <w:r>
+        <w:rPr>
+          <w:rStyle w:val="HTMLCode"/>
+        </w:rPr>
+        <w:t>-h</w:t>
+      </w:r>
+      <w:r>
+        <w:t xml:space="preserve"> flag is for </w:t>
+      </w:r>
+      <w:r>
+        <w:rPr>
+          <w:rStyle w:val="HTMLCode"/>
+        </w:rPr>
+        <w:t>--help</w:t>
+      </w:r>
+      <w:r>
+        <w:t>, not for specifying a host or server URL.</w:t>
+      </w:r>
+    </w:p>
+    <w:p>
+      <w:pPr>
+        <w:pStyle w:val="NormalWeb"/>
+        <w:numPr>
+          <w:ilvl w:val="0"/>
+          <w:numId w:val="20"/>
+        </w:numPr>
+      </w:pPr>
+      <w:r>
+        <w:rPr>
+          <w:rStyle w:val="HTMLCode"/>
+          <w:b/>
+          <w:bCs/>
+        </w:rPr>
+        <w:t>docker login jerry docker-registry.company.com</w:t>
+      </w:r>
+      <w:r>
+        <w:t xml:space="preserve"> This is incorrect. Without the </w:t>
+      </w:r>
+      <w:r>
+        <w:rPr>
+          <w:rStyle w:val="HTMLCode"/>
+        </w:rPr>
+        <w:t>--username</w:t>
+      </w:r>
+      <w:r>
+        <w:t xml:space="preserve"> or </w:t>
+      </w:r>
+      <w:r>
+        <w:rPr>
+          <w:rStyle w:val="HTMLCode"/>
+        </w:rPr>
+        <w:t>-u</w:t>
+      </w:r>
+      <w:r>
+        <w:t xml:space="preserve"> flag, Docker will interpret "jerry" as the server address and prompt for a username.</w:t>
+      </w:r>
+    </w:p>
+    <w:p>
+      <w:pPr>
+        <w:pStyle w:val="Heading3"/>
+      </w:pPr>
+      <w:r>
+        <w:t>Main Difference between ENTRYPOINT and CMD</w:t>
+      </w:r>
+    </w:p>
+    <w:p>
+      <w:pPr>
+        <w:pStyle w:val="NormalWeb"/>
+      </w:pPr>
+      <w:r>
+        <w:t xml:space="preserve">The main difference is that </w:t>
+      </w:r>
+      <w:r>
+        <w:rPr>
+          <w:rStyle w:val="HTMLCode"/>
+        </w:rPr>
+        <w:t>ENTRYPOINT</w:t>
+      </w:r>
+      <w:r>
+        <w:t xml:space="preserve"> configures a container to run as a specific executable, while </w:t>
+      </w:r>
+      <w:r>
+        <w:rPr>
+          <w:rStyle w:val="HTMLCode"/>
+        </w:rPr>
+        <w:t>CMD</w:t>
+      </w:r>
+      <w:r>
+        <w:t xml:space="preserve"> provides default arguments that can be easily overridden.</w:t>
+      </w:r>
+    </w:p>
+    <w:p>
+      <w:pPr>
+        <w:pStyle w:val="NormalWeb"/>
+      </w:pPr>
+      <w:r>
+        <w:t>The last option in the image is the most accurate description.</w:t>
+      </w:r>
+    </w:p>
+    <w:p>
+      <w:r>
+        <w:rPr>
+          <w:noProof/>
+        </w:rPr>
+        <w:lastRenderedPageBreak/>
+        <w:pict w14:anchorId="5E172604">
+          <v:rect id="_x0000_i1025" alt="" style="width:451.3pt;height:.05pt;mso-width-percent:0;mso-height-percent:0;mso-width-percent:0;mso-height-percent:0" o:hralign="center" o:hrstd="t" o:hr="t" fillcolor="#a0a0a0" stroked="f"/>
+        </w:pict>
+      </w:r>
+    </w:p>
+    <w:p>
+      <w:pPr>
+        <w:pStyle w:val="Heading3"/>
+      </w:pPr>
+      <w:r>
+        <w:t>Key Differences</w:t>
+      </w:r>
+    </w:p>
+    <w:p>
+      <w:pPr>
+        <w:pStyle w:val="NormalWeb"/>
+        <w:numPr>
+          <w:ilvl w:val="0"/>
+          <w:numId w:val="21"/>
+        </w:numPr>
+      </w:pPr>
+      <w:r>
+        <w:rPr>
+          <w:rStyle w:val="HTMLCode"/>
+          <w:b/>
+          <w:bCs/>
+        </w:rPr>
+        <w:t>ENTRYPOINT</w:t>
+      </w:r>
+      <w:r>
+        <w:t xml:space="preserve">: Sets the main command or executable that will </w:t>
+      </w:r>
+      <w:r>
+        <w:rPr>
+          <w:b/>
+          <w:bCs/>
+        </w:rPr>
+        <w:t>always</w:t>
+      </w:r>
+      <w:r>
+        <w:t xml:space="preserve"> be run when the container starts. Arguments provided to </w:t>
+      </w:r>
+      <w:r>
+        <w:rPr>
+          <w:rStyle w:val="HTMLCode"/>
+        </w:rPr>
+        <w:t>docker run</w:t>
+      </w:r>
+      <w:r>
+        <w:t xml:space="preserve"> are appended to the </w:t>
+      </w:r>
+      <w:r>
+        <w:rPr>
+          <w:rStyle w:val="HTMLCode"/>
+        </w:rPr>
+        <w:t>ENTRYPOINT</w:t>
+      </w:r>
+      <w:r>
+        <w:t>. It's meant for defining the primary purpose of the container.</w:t>
+      </w:r>
+    </w:p>
+    <w:p>
+      <w:pPr>
+        <w:pStyle w:val="NormalWeb"/>
+        <w:numPr>
+          <w:ilvl w:val="1"/>
+          <w:numId w:val="21"/>
+        </w:numPr>
+      </w:pPr>
+      <w:r>
+        <w:rPr>
+          <w:b/>
+          <w:bCs/>
+        </w:rPr>
+        <w:t>Example</w:t>
+      </w:r>
+      <w:r>
+        <w:t xml:space="preserve">: </w:t>
+      </w:r>
+      <w:r>
+        <w:rPr>
+          <w:rStyle w:val="HTMLCode"/>
+        </w:rPr>
+        <w:t>ENTRYPOINT ["/</w:t>
+      </w:r>
+      <w:proofErr w:type="spellStart"/>
+      <w:r>
+        <w:rPr>
+          <w:rStyle w:val="HTMLCode"/>
+        </w:rPr>
+        <w:t>usr</w:t>
+      </w:r>
+      <w:proofErr w:type="spellEnd"/>
+      <w:r>
+        <w:rPr>
+          <w:rStyle w:val="HTMLCode"/>
+        </w:rPr>
+        <w:t>/bin/ping"]</w:t>
+      </w:r>
+    </w:p>
+    <w:p>
+      <w:pPr>
+        <w:pStyle w:val="NormalWeb"/>
+        <w:numPr>
+          <w:ilvl w:val="0"/>
+          <w:numId w:val="21"/>
+        </w:numPr>
+      </w:pPr>
+      <w:r>
+        <w:rPr>
+          <w:rStyle w:val="HTMLCode"/>
+          <w:b/>
+          <w:bCs/>
+        </w:rPr>
+        <w:t>CMD</w:t>
+      </w:r>
+      <w:r>
+        <w:t xml:space="preserve">: Provides default arguments for the </w:t>
+      </w:r>
+      <w:r>
+        <w:rPr>
+          <w:rStyle w:val="HTMLCode"/>
+        </w:rPr>
+        <w:t>ENTRYPOINT</w:t>
+      </w:r>
+      <w:r>
+        <w:t xml:space="preserve"> or, if no </w:t>
+      </w:r>
+      <w:r>
+        <w:rPr>
+          <w:rStyle w:val="HTMLCode"/>
+        </w:rPr>
+        <w:t>ENTRYPOINT</w:t>
+      </w:r>
+      <w:r>
+        <w:t xml:space="preserve"> is present, it sets a default command to be executed. These defaults can be overridden by simply providing a command when you run the container.</w:t>
+      </w:r>
+    </w:p>
+    <w:p>
+      <w:pPr>
+        <w:pStyle w:val="NormalWeb"/>
+        <w:numPr>
+          <w:ilvl w:val="1"/>
+          <w:numId w:val="21"/>
+        </w:numPr>
+      </w:pPr>
+      <w:r>
+        <w:rPr>
+          <w:b/>
+          <w:bCs/>
+        </w:rPr>
+        <w:t>Example</w:t>
+      </w:r>
+      <w:r>
+        <w:t xml:space="preserve">: </w:t>
+      </w:r>
+      <w:r>
+        <w:rPr>
+          <w:rStyle w:val="HTMLCode"/>
+        </w:rPr>
+        <w:t>CMD ["google.com"]</w:t>
+      </w:r>
+    </w:p>
+    <w:p>
+      <w:pPr>
+        <w:pStyle w:val="Heading3"/>
+      </w:pPr>
+      <w:r>
+        <w:t>How They Work Together</w:t>
+      </w:r>
+    </w:p>
+    <w:p>
+      <w:pPr>
+        <w:pStyle w:val="NormalWeb"/>
+      </w:pPr>
+      <w:r>
+        <w:t xml:space="preserve">When you use both, </w:t>
+      </w:r>
+      <w:r>
+        <w:rPr>
+          <w:rStyle w:val="HTMLCode"/>
+        </w:rPr>
+        <w:t>CMD</w:t>
+      </w:r>
+      <w:r>
+        <w:t xml:space="preserve"> sets the default parameters for the </w:t>
+      </w:r>
+      <w:r>
+        <w:rPr>
+          <w:rStyle w:val="HTMLCode"/>
+        </w:rPr>
+        <w:t>ENTRYPOINT</w:t>
+      </w:r>
+      <w:r>
+        <w:t xml:space="preserve"> executable.</w:t>
+      </w:r>
+    </w:p>
+    <w:p>
+      <w:pPr>
+        <w:pStyle w:val="NormalWeb"/>
+      </w:pPr>
+      <w:r>
+        <w:t xml:space="preserve">Consider this </w:t>
+      </w:r>
+      <w:proofErr w:type="spellStart"/>
+      <w:r>
+        <w:t>Dockerfile</w:t>
+      </w:r>
+      <w:proofErr w:type="spellEnd"/>
+      <w:r>
+        <w:t>:</w:t>
+      </w:r>
+    </w:p>
+    <w:p>
+      <w:proofErr w:type="spellStart"/>
+      <w:r>
+        <w:rPr>
+          <w:rStyle w:val="ng-tns-c2709846391-110"/>
+        </w:rPr>
+        <w:t>Dockerfile</w:t>
+      </w:r>
+      <w:proofErr w:type="spellEnd"/>
+    </w:p>
+    <w:p>
+      <w:pPr>
+        <w:pStyle w:val="HTMLPreformatted"/>
+        <w:rPr>
+          <w:rStyle w:val="HTMLCode"/>
+        </w:rPr>
+      </w:pPr>
+      <w:r>
+        <w:rPr>
+          <w:rStyle w:val="hljs-keyword"/>
+        </w:rPr>
+        <w:t>ENTRYPOINT</w:t>
+      </w:r>
+      <w:r>
+        <w:rPr>
+          <w:rStyle w:val="bash"/>
+        </w:rPr>
+        <w:t xml:space="preserve"> [</w:t>
+      </w:r>
+      <w:r>
+        <w:rPr>
+          <w:rStyle w:val="hljs-string"/>
+        </w:rPr>
+        <w:t>"ping"</w:t>
+      </w:r>
+      <w:r>
+        <w:rPr>
+          <w:rStyle w:val="bash"/>
+        </w:rPr>
+        <w:t xml:space="preserve">, </w:t>
+      </w:r>
+      <w:r>
+        <w:rPr>
+          <w:rStyle w:val="hljs-string"/>
+        </w:rPr>
+        <w:t>"-c"</w:t>
+      </w:r>
+      <w:r>
+        <w:rPr>
+          <w:rStyle w:val="bash"/>
+        </w:rPr>
+        <w:t xml:space="preserve">, </w:t>
+      </w:r>
+      <w:r>
+        <w:rPr>
+          <w:rStyle w:val="hljs-string"/>
+        </w:rPr>
+        <w:t>"3"</w:t>
+      </w:r>
+      <w:r>
+        <w:rPr>
+          <w:rStyle w:val="bash"/>
+        </w:rPr>
+        <w:t>]</w:t>
+      </w:r>
+    </w:p>
+    <w:p>
+      <w:pPr>
+        <w:pStyle w:val="HTMLPreformatted"/>
+        <w:rPr>
+          <w:rStyle w:val="HTMLCode"/>
+        </w:rPr>
+      </w:pPr>
+      <w:r>
+        <w:rPr>
+          <w:rStyle w:val="hljs-keyword"/>
+        </w:rPr>
+        <w:t>CMD</w:t>
+      </w:r>
+      <w:r>
+        <w:rPr>
+          <w:rStyle w:val="bash"/>
+        </w:rPr>
+        <w:t xml:space="preserve"> [</w:t>
+      </w:r>
+      <w:r>
+        <w:rPr>
+          <w:rStyle w:val="hljs-string"/>
+        </w:rPr>
+        <w:t>"localhost"</w:t>
+      </w:r>
+      <w:r>
+        <w:rPr>
+          <w:rStyle w:val="bash"/>
+        </w:rPr>
+        <w:t>]</w:t>
+      </w:r>
+    </w:p>
+    <w:p>
+      <w:pPr>
+        <w:pStyle w:val="NormalWeb"/>
+        <w:numPr>
+          <w:ilvl w:val="0"/>
+          <w:numId w:val="22"/>
+        </w:numPr>
+      </w:pPr>
+      <w:r>
+        <w:t xml:space="preserve">Running </w:t>
+      </w:r>
+      <w:r>
+        <w:rPr>
+          <w:rStyle w:val="HTMLCode"/>
+        </w:rPr>
+        <w:t>docker run &lt;image-name&gt;</w:t>
+      </w:r>
+      <w:r>
+        <w:t xml:space="preserve"> will execute </w:t>
+      </w:r>
+      <w:r>
+        <w:rPr>
+          <w:rStyle w:val="HTMLCode"/>
+        </w:rPr>
+        <w:t>ping -c 3 localhost</w:t>
+      </w:r>
+      <w:r>
+        <w:t>.</w:t>
+      </w:r>
+    </w:p>
+    <w:p>
+      <w:pPr>
+        <w:pStyle w:val="NormalWeb"/>
+        <w:numPr>
+          <w:ilvl w:val="0"/>
+          <w:numId w:val="22"/>
+        </w:numPr>
+      </w:pPr>
+      <w:r>
+        <w:t xml:space="preserve">Running </w:t>
+      </w:r>
+      <w:r>
+        <w:rPr>
+          <w:rStyle w:val="HTMLCode"/>
+        </w:rPr>
+        <w:t>docker run &lt;image-name&gt; google.com</w:t>
+      </w:r>
+      <w:r>
+        <w:t xml:space="preserve"> will override the </w:t>
+      </w:r>
+      <w:r>
+        <w:rPr>
+          <w:rStyle w:val="HTMLCode"/>
+        </w:rPr>
+        <w:t>CMD</w:t>
+      </w:r>
+      <w:r>
+        <w:t xml:space="preserve"> and execute </w:t>
+      </w:r>
+      <w:r>
+        <w:rPr>
+          <w:rStyle w:val="HTMLCode"/>
+        </w:rPr>
+        <w:t>ping -c 3 google.com</w:t>
+      </w:r>
+      <w:r>
+        <w:t>.</w:t>
+      </w:r>
+    </w:p>
+    <w:p>
+      <w:pPr>
+        <w:pStyle w:val="NormalWeb"/>
+      </w:pPr>
+      <w:r>
+        <w:t xml:space="preserve">In summary, </w:t>
+      </w:r>
+      <w:r>
+        <w:rPr>
+          <w:rStyle w:val="HTMLCode"/>
+        </w:rPr>
+        <w:t>ENTRYPOINT</w:t>
+      </w:r>
+      <w:r>
+        <w:t xml:space="preserve"> defines the container's executable, and </w:t>
+      </w:r>
+      <w:r>
+        <w:rPr>
+          <w:rStyle w:val="HTMLCode"/>
+        </w:rPr>
+        <w:t>CMD</w:t>
+      </w:r>
+      <w:r>
+        <w:t xml:space="preserve"> defines the default, overridable arguments for it.</w:t>
+      </w:r>
+    </w:p>
+    <w:p>
+      <w:pPr>
+        <w:pStyle w:val="Heading3"/>
+      </w:pPr>
+      <w:r>
+        <w:t>Run interactive shell on a running container</w:t>
+      </w:r>
+      <w:r>
+        <w:t>:</w:t>
+      </w:r>
+    </w:p>
+    <w:p>
+      <w:pPr>
+        <w:pStyle w:val="Heading3"/>
+      </w:pPr>
+      <w:r>
+        <w:t>Command Breakdown</w:t>
+      </w:r>
+    </w:p>
+    <w:p>
+      <w:pPr>
+        <w:pStyle w:val="NormalWeb"/>
+      </w:pPr>
+      <w:r>
+        <w:t>Here’s why that command is the right choice and the others are incorrect:</w:t>
+      </w:r>
+    </w:p>
+    <w:p>
+      <w:pPr>
+        <w:pStyle w:val="NormalWeb"/>
+        <w:numPr>
+          <w:ilvl w:val="0"/>
+          <w:numId w:val="23"/>
+        </w:numPr>
+      </w:pPr>
+      <w:r>
+        <w:rPr>
+          <w:rStyle w:val="HTMLCode"/>
+          <w:b/>
+          <w:bCs/>
+        </w:rPr>
+        <w:t xml:space="preserve">docker exec -it </w:t>
+      </w:r>
+      <w:proofErr w:type="spellStart"/>
+      <w:r>
+        <w:rPr>
+          <w:rStyle w:val="HTMLCode"/>
+          <w:b/>
+          <w:bCs/>
+        </w:rPr>
+        <w:t>mycontainer</w:t>
+      </w:r>
+      <w:proofErr w:type="spellEnd"/>
+      <w:r>
+        <w:rPr>
+          <w:rStyle w:val="HTMLCode"/>
+          <w:b/>
+          <w:bCs/>
+        </w:rPr>
+        <w:t xml:space="preserve"> /bin/bash</w:t>
+      </w:r>
+      <w:r>
+        <w:rPr>
+          <w:b/>
+          <w:bCs/>
+        </w:rPr>
+        <w:t xml:space="preserve"> (Correct) </w:t>
+      </w:r>
+      <w:r>
+        <w:rPr>
+          <w:rFonts w:ascii="Apple Color Emoji" w:hAnsi="Apple Color Emoji" w:cs="Apple Color Emoji"/>
+          <w:b/>
+          <w:bCs/>
+        </w:rPr>
+        <w:t>✅</w:t>
+      </w:r>
+      <w:r>
+        <w:t xml:space="preserve"> This command correctly uses </w:t>
+      </w:r>
+      <w:r>
+        <w:rPr>
+          <w:rStyle w:val="HTMLCode"/>
+        </w:rPr>
+        <w:t>docker exec</w:t>
+      </w:r>
+      <w:r>
+        <w:t xml:space="preserve"> to execute a command in an </w:t>
+      </w:r>
+      <w:r>
+        <w:rPr>
+          <w:i/>
+          <w:iCs/>
+        </w:rPr>
+        <w:t>already running</w:t>
+      </w:r>
+      <w:r>
+        <w:t xml:space="preserve"> container. The flags are essential:</w:t>
+      </w:r>
+    </w:p>
+    <w:p>
+      <w:pPr>
+        <w:pStyle w:val="NormalWeb"/>
+        <w:numPr>
+          <w:ilvl w:val="1"/>
+          <w:numId w:val="23"/>
+        </w:numPr>
+      </w:pPr>
+      <w:r>
+        <w:rPr>
+          <w:rStyle w:val="HTMLCode"/>
+          <w:b/>
+          <w:bCs/>
+        </w:rPr>
+        <w:t>-</w:t>
+      </w:r>
+      <w:proofErr w:type="spellStart"/>
+      <w:r>
+        <w:rPr>
+          <w:rStyle w:val="HTMLCode"/>
+          <w:b/>
+          <w:bCs/>
+        </w:rPr>
+        <w:t>i</w:t>
+      </w:r>
+      <w:proofErr w:type="spellEnd"/>
+      <w:r>
+        <w:t xml:space="preserve"> (</w:t>
+      </w:r>
+      <w:r>
+        <w:rPr>
+          <w:rStyle w:val="HTMLCode"/>
+        </w:rPr>
+        <w:t>--interactive</w:t>
+      </w:r>
+      <w:r>
+        <w:t>): Keeps STDIN open, allowing you to type commands into the shell.</w:t>
+      </w:r>
+    </w:p>
+    <w:p>
+      <w:pPr>
+        <w:pStyle w:val="NormalWeb"/>
+        <w:numPr>
+          <w:ilvl w:val="1"/>
+          <w:numId w:val="23"/>
+        </w:numPr>
+      </w:pPr>
+      <w:r>
+        <w:rPr>
+          <w:rStyle w:val="HTMLCode"/>
+          <w:b/>
+          <w:bCs/>
+        </w:rPr>
+        <w:t>-t</w:t>
+      </w:r>
+      <w:r>
+        <w:t xml:space="preserve"> (</w:t>
+      </w:r>
+      <w:r>
+        <w:rPr>
+          <w:rStyle w:val="HTMLCode"/>
+        </w:rPr>
+        <w:t>--</w:t>
+      </w:r>
+      <w:proofErr w:type="spellStart"/>
+      <w:r>
+        <w:rPr>
+          <w:rStyle w:val="HTMLCode"/>
+        </w:rPr>
+        <w:t>tty</w:t>
+      </w:r>
+      <w:proofErr w:type="spellEnd"/>
+      <w:r>
+        <w:t>): Allocates a pseudo-terminal, which gives you the interactive shell interface.</w:t>
+      </w:r>
+    </w:p>
+    <w:p>
+      <w:pPr>
+        <w:pStyle w:val="NormalWeb"/>
+        <w:numPr>
+          <w:ilvl w:val="1"/>
+          <w:numId w:val="23"/>
+        </w:numPr>
+      </w:pPr>
+      <w:proofErr w:type="spellStart"/>
+      <w:r>
+        <w:rPr>
+          <w:rStyle w:val="HTMLCode"/>
+          <w:b/>
+          <w:bCs/>
+        </w:rPr>
+        <w:t>mycontainer</w:t>
+      </w:r>
+      <w:proofErr w:type="spellEnd"/>
+      <w:r>
+        <w:t>: The name of the running container you want to access.</w:t>
+      </w:r>
+    </w:p>
+    <w:p>
+      <w:pPr>
+        <w:pStyle w:val="NormalWeb"/>
+        <w:numPr>
+          <w:ilvl w:val="1"/>
+          <w:numId w:val="23"/>
+        </w:numPr>
+      </w:pPr>
+      <w:r>
+        <w:rPr>
+          <w:rStyle w:val="HTMLCode"/>
+          <w:b/>
+          <w:bCs/>
+        </w:rPr>
+        <w:t>/bin/bash</w:t>
+      </w:r>
+      <w:r>
+        <w:t>: The command to run inside the container, in this case, the Bash shell.</w:t>
+      </w:r>
+    </w:p>
+    <w:p>
+      <w:pPr>
+        <w:pStyle w:val="Heading3"/>
+      </w:pPr>
+      <w:r>
+        <w:lastRenderedPageBreak/>
+        <w:t>Incorrect Options</w:t>
+      </w:r>
+    </w:p>
+    <w:p>
+      <w:pPr>
+        <w:pStyle w:val="NormalWeb"/>
+        <w:numPr>
+          <w:ilvl w:val="0"/>
+          <w:numId w:val="24"/>
+        </w:numPr>
+      </w:pPr>
+      <w:r>
+        <w:rPr>
+          <w:rStyle w:val="HTMLCode"/>
+          <w:b/>
+          <w:bCs/>
+        </w:rPr>
+        <w:t xml:space="preserve">docker exec -d </w:t>
+      </w:r>
+      <w:proofErr w:type="spellStart"/>
+      <w:r>
+        <w:rPr>
+          <w:rStyle w:val="HTMLCode"/>
+          <w:b/>
+          <w:bCs/>
+        </w:rPr>
+        <w:t>mycontainer</w:t>
+      </w:r>
+      <w:proofErr w:type="spellEnd"/>
+      <w:r>
+        <w:rPr>
+          <w:rStyle w:val="HTMLCode"/>
+          <w:b/>
+          <w:bCs/>
+        </w:rPr>
+        <w:t xml:space="preserve"> --interactive /bin/bash</w:t>
+      </w:r>
+      <w:r>
+        <w:t xml:space="preserve">: The </w:t>
+      </w:r>
+      <w:r>
+        <w:rPr>
+          <w:rStyle w:val="HTMLCode"/>
+        </w:rPr>
+        <w:t>-d</w:t>
+      </w:r>
+      <w:r>
+        <w:t xml:space="preserve"> (</w:t>
+      </w:r>
+      <w:r>
+        <w:rPr>
+          <w:rStyle w:val="HTMLCode"/>
+        </w:rPr>
+        <w:t>--detach</w:t>
+      </w:r>
+      <w:r>
+        <w:t>) flag runs the command in the background. This is the opposite of an interactive session.</w:t>
+      </w:r>
+    </w:p>
+    <w:p>
+      <w:pPr>
+        <w:pStyle w:val="NormalWeb"/>
+        <w:numPr>
+          <w:ilvl w:val="0"/>
+          <w:numId w:val="24"/>
+        </w:numPr>
+      </w:pPr>
+      <w:r>
+        <w:rPr>
+          <w:rStyle w:val="HTMLCode"/>
+          <w:b/>
+          <w:bCs/>
+        </w:rPr>
+        <w:t xml:space="preserve">docker </w:t>
+      </w:r>
+      <w:proofErr w:type="spellStart"/>
+      <w:r>
+        <w:rPr>
+          <w:rStyle w:val="HTMLCode"/>
+          <w:b/>
+          <w:bCs/>
+        </w:rPr>
+        <w:t>ssh</w:t>
+      </w:r>
+      <w:proofErr w:type="spellEnd"/>
+      <w:r>
+        <w:rPr>
+          <w:rStyle w:val="HTMLCode"/>
+          <w:b/>
+          <w:bCs/>
+        </w:rPr>
+        <w:t xml:space="preserve"> </w:t>
+      </w:r>
+      <w:proofErr w:type="spellStart"/>
+      <w:r>
+        <w:rPr>
+          <w:rStyle w:val="HTMLCode"/>
+          <w:b/>
+          <w:bCs/>
+        </w:rPr>
+        <w:t>mycontainer</w:t>
+      </w:r>
+      <w:proofErr w:type="spellEnd"/>
+      <w:r>
+        <w:t xml:space="preserve">: </w:t>
+      </w:r>
+      <w:r>
+        <w:rPr>
+          <w:rStyle w:val="HTMLCode"/>
+        </w:rPr>
+        <w:t xml:space="preserve">docker </w:t>
+      </w:r>
+      <w:proofErr w:type="spellStart"/>
+      <w:r>
+        <w:rPr>
+          <w:rStyle w:val="HTMLCode"/>
+        </w:rPr>
+        <w:t>ssh</w:t>
+      </w:r>
+      <w:proofErr w:type="spellEnd"/>
+      <w:r>
+        <w:t xml:space="preserve"> is not a standard Docker command. The correct way to get a shell in a running container is with </w:t>
+      </w:r>
+      <w:r>
+        <w:rPr>
+          <w:rStyle w:val="HTMLCode"/>
+        </w:rPr>
+        <w:t>docker exec</w:t>
+      </w:r>
+      <w:r>
+        <w:t>.</w:t>
+      </w:r>
+    </w:p>
+    <w:p>
+      <w:pPr>
+        <w:pStyle w:val="NormalWeb"/>
+        <w:numPr>
+          <w:ilvl w:val="0"/>
+          <w:numId w:val="24"/>
+        </w:numPr>
+      </w:pPr>
+      <w:r>
+        <w:rPr>
+          <w:rStyle w:val="HTMLCode"/>
+          <w:b/>
+          <w:bCs/>
+        </w:rPr>
+        <w:t xml:space="preserve">docker run -it </w:t>
+      </w:r>
+      <w:proofErr w:type="spellStart"/>
+      <w:r>
+        <w:rPr>
+          <w:rStyle w:val="HTMLCode"/>
+          <w:b/>
+          <w:bCs/>
+        </w:rPr>
+        <w:t>mycontainer</w:t>
+      </w:r>
+      <w:proofErr w:type="spellEnd"/>
+      <w:r>
+        <w:rPr>
+          <w:rStyle w:val="HTMLCode"/>
+          <w:b/>
+          <w:bCs/>
+        </w:rPr>
+        <w:t xml:space="preserve"> /bin/bash</w:t>
+      </w:r>
+      <w:r>
+        <w:t xml:space="preserve">: The </w:t>
+      </w:r>
+      <w:r>
+        <w:rPr>
+          <w:rStyle w:val="HTMLCode"/>
+        </w:rPr>
+        <w:t>docker run</w:t>
+      </w:r>
+      <w:r>
+        <w:t xml:space="preserve"> command is used to create and start a </w:t>
+      </w:r>
+      <w:r>
+        <w:rPr>
+          <w:b/>
+          <w:bCs/>
+        </w:rPr>
+        <w:t>new</w:t>
+      </w:r>
+      <w:r>
+        <w:t xml:space="preserve"> container from an image, not to access an existing running one.</w:t>
+      </w:r>
+    </w:p>
+    <w:p/>
     <w:sectPr>
       <w:pgSz w:w="12240" w:h="15840"/>
       <w:pgMar w:top="1440" w:right="1440" w:bottom="1440" w:left="1440" w:header="0" w:footer="720" w:gutter="0"/>
@@ -2091,6 +3937,900 @@
     </w:lvl>
   </w:abstractNum>
   <w:abstractNum w:abstractNumId="7" w15:restartNumberingAfterBreak="0">
+    <w:nsid w:val="2FC42E49"/>
+    <w:multiLevelType w:val="multilevel"/>
+    <w:tmpl w:val="CB8EB6D8"/>
+    <w:lvl w:ilvl="0">
+      <w:start w:val="1"/>
+      <w:numFmt w:val="bullet"/>
+      <w:lvlText w:val=""/>
+      <w:lvlJc w:val="left"/>
+      <w:pPr>
+        <w:tabs>
+          <w:tab w:val="num" w:pos="720"/>
+        </w:tabs>
+        <w:ind w:left="720" w:hanging="360"/>
+      </w:pPr>
+      <w:rPr>
+        <w:rFonts w:ascii="Symbol" w:hAnsi="Symbol" w:hint="default"/>
+        <w:sz w:val="20"/>
+      </w:rPr>
+    </w:lvl>
+    <w:lvl w:ilvl="1">
+      <w:start w:val="1"/>
+      <w:numFmt w:val="bullet"/>
+      <w:lvlText w:val="o"/>
+      <w:lvlJc w:val="left"/>
+      <w:pPr>
+        <w:tabs>
+          <w:tab w:val="num" w:pos="1440"/>
+        </w:tabs>
+        <w:ind w:left="1440" w:hanging="360"/>
+      </w:pPr>
+      <w:rPr>
+        <w:rFonts w:ascii="Courier New" w:hAnsi="Courier New" w:hint="default"/>
+        <w:sz w:val="20"/>
+      </w:rPr>
+    </w:lvl>
+    <w:lvl w:ilvl="2" w:tentative="1">
+      <w:start w:val="1"/>
+      <w:numFmt w:val="bullet"/>
+      <w:lvlText w:val=""/>
+      <w:lvlJc w:val="left"/>
+      <w:pPr>
+        <w:tabs>
+          <w:tab w:val="num" w:pos="2160"/>
+        </w:tabs>
+        <w:ind w:left="2160" w:hanging="360"/>
+      </w:pPr>
+      <w:rPr>
+        <w:rFonts w:ascii="Wingdings" w:hAnsi="Wingdings" w:hint="default"/>
+        <w:sz w:val="20"/>
+      </w:rPr>
+    </w:lvl>
+    <w:lvl w:ilvl="3" w:tentative="1">
+      <w:start w:val="1"/>
+      <w:numFmt w:val="bullet"/>
+      <w:lvlText w:val=""/>
+      <w:lvlJc w:val="left"/>
+      <w:pPr>
+        <w:tabs>
+          <w:tab w:val="num" w:pos="2880"/>
+        </w:tabs>
+        <w:ind w:left="2880" w:hanging="360"/>
+      </w:pPr>
+      <w:rPr>
+        <w:rFonts w:ascii="Wingdings" w:hAnsi="Wingdings" w:hint="default"/>
+        <w:sz w:val="20"/>
+      </w:rPr>
+    </w:lvl>
+    <w:lvl w:ilvl="4" w:tentative="1">
+      <w:start w:val="1"/>
+      <w:numFmt w:val="bullet"/>
+      <w:lvlText w:val=""/>
+      <w:lvlJc w:val="left"/>
+      <w:pPr>
+        <w:tabs>
+          <w:tab w:val="num" w:pos="3600"/>
+        </w:tabs>
+        <w:ind w:left="3600" w:hanging="360"/>
+      </w:pPr>
+      <w:rPr>
+        <w:rFonts w:ascii="Wingdings" w:hAnsi="Wingdings" w:hint="default"/>
+        <w:sz w:val="20"/>
+      </w:rPr>
+    </w:lvl>
+    <w:lvl w:ilvl="5" w:tentative="1">
+      <w:start w:val="1"/>
+      <w:numFmt w:val="bullet"/>
+      <w:lvlText w:val=""/>
+      <w:lvlJc w:val="left"/>
+      <w:pPr>
+        <w:tabs>
+          <w:tab w:val="num" w:pos="4320"/>
+        </w:tabs>
+        <w:ind w:left="4320" w:hanging="360"/>
+      </w:pPr>
+      <w:rPr>
+        <w:rFonts w:ascii="Wingdings" w:hAnsi="Wingdings" w:hint="default"/>
+        <w:sz w:val="20"/>
+      </w:rPr>
+    </w:lvl>
+    <w:lvl w:ilvl="6" w:tentative="1">
+      <w:start w:val="1"/>
+      <w:numFmt w:val="bullet"/>
+      <w:lvlText w:val=""/>
+      <w:lvlJc w:val="left"/>
+      <w:pPr>
+        <w:tabs>
+          <w:tab w:val="num" w:pos="5040"/>
+        </w:tabs>
+        <w:ind w:left="5040" w:hanging="360"/>
+      </w:pPr>
+      <w:rPr>
+        <w:rFonts w:ascii="Wingdings" w:hAnsi="Wingdings" w:hint="default"/>
+        <w:sz w:val="20"/>
+      </w:rPr>
+    </w:lvl>
+    <w:lvl w:ilvl="7" w:tentative="1">
+      <w:start w:val="1"/>
+      <w:numFmt w:val="bullet"/>
+      <w:lvlText w:val=""/>
+      <w:lvlJc w:val="left"/>
+      <w:pPr>
+        <w:tabs>
+          <w:tab w:val="num" w:pos="5760"/>
+        </w:tabs>
+        <w:ind w:left="5760" w:hanging="360"/>
+      </w:pPr>
+      <w:rPr>
+        <w:rFonts w:ascii="Wingdings" w:hAnsi="Wingdings" w:hint="default"/>
+        <w:sz w:val="20"/>
+      </w:rPr>
+    </w:lvl>
+    <w:lvl w:ilvl="8" w:tentative="1">
+      <w:start w:val="1"/>
+      <w:numFmt w:val="bullet"/>
+      <w:lvlText w:val=""/>
+      <w:lvlJc w:val="left"/>
+      <w:pPr>
+        <w:tabs>
+          <w:tab w:val="num" w:pos="6480"/>
+        </w:tabs>
+        <w:ind w:left="6480" w:hanging="360"/>
+      </w:pPr>
+      <w:rPr>
+        <w:rFonts w:ascii="Wingdings" w:hAnsi="Wingdings" w:hint="default"/>
+        <w:sz w:val="20"/>
+      </w:rPr>
+    </w:lvl>
+  </w:abstractNum>
+  <w:abstractNum w:abstractNumId="8" w15:restartNumberingAfterBreak="0">
+    <w:nsid w:val="30B82DC2"/>
+    <w:multiLevelType w:val="multilevel"/>
+    <w:tmpl w:val="4476F6E6"/>
+    <w:lvl w:ilvl="0">
+      <w:start w:val="1"/>
+      <w:numFmt w:val="bullet"/>
+      <w:lvlText w:val=""/>
+      <w:lvlJc w:val="left"/>
+      <w:pPr>
+        <w:tabs>
+          <w:tab w:val="num" w:pos="720"/>
+        </w:tabs>
+        <w:ind w:left="720" w:hanging="360"/>
+      </w:pPr>
+      <w:rPr>
+        <w:rFonts w:ascii="Symbol" w:hAnsi="Symbol" w:hint="default"/>
+        <w:sz w:val="20"/>
+      </w:rPr>
+    </w:lvl>
+    <w:lvl w:ilvl="1" w:tentative="1">
+      <w:start w:val="1"/>
+      <w:numFmt w:val="bullet"/>
+      <w:lvlText w:val="o"/>
+      <w:lvlJc w:val="left"/>
+      <w:pPr>
+        <w:tabs>
+          <w:tab w:val="num" w:pos="1440"/>
+        </w:tabs>
+        <w:ind w:left="1440" w:hanging="360"/>
+      </w:pPr>
+      <w:rPr>
+        <w:rFonts w:ascii="Courier New" w:hAnsi="Courier New" w:hint="default"/>
+        <w:sz w:val="20"/>
+      </w:rPr>
+    </w:lvl>
+    <w:lvl w:ilvl="2" w:tentative="1">
+      <w:start w:val="1"/>
+      <w:numFmt w:val="bullet"/>
+      <w:lvlText w:val=""/>
+      <w:lvlJc w:val="left"/>
+      <w:pPr>
+        <w:tabs>
+          <w:tab w:val="num" w:pos="2160"/>
+        </w:tabs>
+        <w:ind w:left="2160" w:hanging="360"/>
+      </w:pPr>
+      <w:rPr>
+        <w:rFonts w:ascii="Wingdings" w:hAnsi="Wingdings" w:hint="default"/>
+        <w:sz w:val="20"/>
+      </w:rPr>
+    </w:lvl>
+    <w:lvl w:ilvl="3" w:tentative="1">
+      <w:start w:val="1"/>
+      <w:numFmt w:val="bullet"/>
+      <w:lvlText w:val=""/>
+      <w:lvlJc w:val="left"/>
+      <w:pPr>
+        <w:tabs>
+          <w:tab w:val="num" w:pos="2880"/>
+        </w:tabs>
+        <w:ind w:left="2880" w:hanging="360"/>
+      </w:pPr>
+      <w:rPr>
+        <w:rFonts w:ascii="Wingdings" w:hAnsi="Wingdings" w:hint="default"/>
+        <w:sz w:val="20"/>
+      </w:rPr>
+    </w:lvl>
+    <w:lvl w:ilvl="4" w:tentative="1">
+      <w:start w:val="1"/>
+      <w:numFmt w:val="bullet"/>
+      <w:lvlText w:val=""/>
+      <w:lvlJc w:val="left"/>
+      <w:pPr>
+        <w:tabs>
+          <w:tab w:val="num" w:pos="3600"/>
+        </w:tabs>
+        <w:ind w:left="3600" w:hanging="360"/>
+      </w:pPr>
+      <w:rPr>
+        <w:rFonts w:ascii="Wingdings" w:hAnsi="Wingdings" w:hint="default"/>
+        <w:sz w:val="20"/>
+      </w:rPr>
+    </w:lvl>
+    <w:lvl w:ilvl="5" w:tentative="1">
+      <w:start w:val="1"/>
+      <w:numFmt w:val="bullet"/>
+      <w:lvlText w:val=""/>
+      <w:lvlJc w:val="left"/>
+      <w:pPr>
+        <w:tabs>
+          <w:tab w:val="num" w:pos="4320"/>
+        </w:tabs>
+        <w:ind w:left="4320" w:hanging="360"/>
+      </w:pPr>
+      <w:rPr>
+        <w:rFonts w:ascii="Wingdings" w:hAnsi="Wingdings" w:hint="default"/>
+        <w:sz w:val="20"/>
+      </w:rPr>
+    </w:lvl>
+    <w:lvl w:ilvl="6" w:tentative="1">
+      <w:start w:val="1"/>
+      <w:numFmt w:val="bullet"/>
+      <w:lvlText w:val=""/>
+      <w:lvlJc w:val="left"/>
+      <w:pPr>
+        <w:tabs>
+          <w:tab w:val="num" w:pos="5040"/>
+        </w:tabs>
+        <w:ind w:left="5040" w:hanging="360"/>
+      </w:pPr>
+      <w:rPr>
+        <w:rFonts w:ascii="Wingdings" w:hAnsi="Wingdings" w:hint="default"/>
+        <w:sz w:val="20"/>
+      </w:rPr>
+    </w:lvl>
+    <w:lvl w:ilvl="7" w:tentative="1">
+      <w:start w:val="1"/>
+      <w:numFmt w:val="bullet"/>
+      <w:lvlText w:val=""/>
+      <w:lvlJc w:val="left"/>
+      <w:pPr>
+        <w:tabs>
+          <w:tab w:val="num" w:pos="5760"/>
+        </w:tabs>
+        <w:ind w:left="5760" w:hanging="360"/>
+      </w:pPr>
+      <w:rPr>
+        <w:rFonts w:ascii="Wingdings" w:hAnsi="Wingdings" w:hint="default"/>
+        <w:sz w:val="20"/>
+      </w:rPr>
+    </w:lvl>
+    <w:lvl w:ilvl="8" w:tentative="1">
+      <w:start w:val="1"/>
+      <w:numFmt w:val="bullet"/>
+      <w:lvlText w:val=""/>
+      <w:lvlJc w:val="left"/>
+      <w:pPr>
+        <w:tabs>
+          <w:tab w:val="num" w:pos="6480"/>
+        </w:tabs>
+        <w:ind w:left="6480" w:hanging="360"/>
+      </w:pPr>
+      <w:rPr>
+        <w:rFonts w:ascii="Wingdings" w:hAnsi="Wingdings" w:hint="default"/>
+        <w:sz w:val="20"/>
+      </w:rPr>
+    </w:lvl>
+  </w:abstractNum>
+  <w:abstractNum w:abstractNumId="9" w15:restartNumberingAfterBreak="0">
+    <w:nsid w:val="32F17924"/>
+    <w:multiLevelType w:val="multilevel"/>
+    <w:tmpl w:val="70FCF39A"/>
+    <w:lvl w:ilvl="0">
+      <w:start w:val="1"/>
+      <w:numFmt w:val="bullet"/>
+      <w:lvlText w:val=""/>
+      <w:lvlJc w:val="left"/>
+      <w:pPr>
+        <w:tabs>
+          <w:tab w:val="num" w:pos="720"/>
+        </w:tabs>
+        <w:ind w:left="720" w:hanging="360"/>
+      </w:pPr>
+      <w:rPr>
+        <w:rFonts w:ascii="Symbol" w:hAnsi="Symbol" w:hint="default"/>
+        <w:sz w:val="20"/>
+      </w:rPr>
+    </w:lvl>
+    <w:lvl w:ilvl="1" w:tentative="1">
+      <w:start w:val="1"/>
+      <w:numFmt w:val="bullet"/>
+      <w:lvlText w:val="o"/>
+      <w:lvlJc w:val="left"/>
+      <w:pPr>
+        <w:tabs>
+          <w:tab w:val="num" w:pos="1440"/>
+        </w:tabs>
+        <w:ind w:left="1440" w:hanging="360"/>
+      </w:pPr>
+      <w:rPr>
+        <w:rFonts w:ascii="Courier New" w:hAnsi="Courier New" w:hint="default"/>
+        <w:sz w:val="20"/>
+      </w:rPr>
+    </w:lvl>
+    <w:lvl w:ilvl="2" w:tentative="1">
+      <w:start w:val="1"/>
+      <w:numFmt w:val="bullet"/>
+      <w:lvlText w:val=""/>
+      <w:lvlJc w:val="left"/>
+      <w:pPr>
+        <w:tabs>
+          <w:tab w:val="num" w:pos="2160"/>
+        </w:tabs>
+        <w:ind w:left="2160" w:hanging="360"/>
+      </w:pPr>
+      <w:rPr>
+        <w:rFonts w:ascii="Wingdings" w:hAnsi="Wingdings" w:hint="default"/>
+        <w:sz w:val="20"/>
+      </w:rPr>
+    </w:lvl>
+    <w:lvl w:ilvl="3" w:tentative="1">
+      <w:start w:val="1"/>
+      <w:numFmt w:val="bullet"/>
+      <w:lvlText w:val=""/>
+      <w:lvlJc w:val="left"/>
+      <w:pPr>
+        <w:tabs>
+          <w:tab w:val="num" w:pos="2880"/>
+        </w:tabs>
+        <w:ind w:left="2880" w:hanging="360"/>
+      </w:pPr>
+      <w:rPr>
+        <w:rFonts w:ascii="Wingdings" w:hAnsi="Wingdings" w:hint="default"/>
+        <w:sz w:val="20"/>
+      </w:rPr>
+    </w:lvl>
+    <w:lvl w:ilvl="4" w:tentative="1">
+      <w:start w:val="1"/>
+      <w:numFmt w:val="bullet"/>
+      <w:lvlText w:val=""/>
+      <w:lvlJc w:val="left"/>
+      <w:pPr>
+        <w:tabs>
+          <w:tab w:val="num" w:pos="3600"/>
+        </w:tabs>
+        <w:ind w:left="3600" w:hanging="360"/>
+      </w:pPr>
+      <w:rPr>
+        <w:rFonts w:ascii="Wingdings" w:hAnsi="Wingdings" w:hint="default"/>
+        <w:sz w:val="20"/>
+      </w:rPr>
+    </w:lvl>
+    <w:lvl w:ilvl="5" w:tentative="1">
+      <w:start w:val="1"/>
+      <w:numFmt w:val="bullet"/>
+      <w:lvlText w:val=""/>
+      <w:lvlJc w:val="left"/>
+      <w:pPr>
+        <w:tabs>
+          <w:tab w:val="num" w:pos="4320"/>
+        </w:tabs>
+        <w:ind w:left="4320" w:hanging="360"/>
+      </w:pPr>
+      <w:rPr>
+        <w:rFonts w:ascii="Wingdings" w:hAnsi="Wingdings" w:hint="default"/>
+        <w:sz w:val="20"/>
+      </w:rPr>
+    </w:lvl>
+    <w:lvl w:ilvl="6" w:tentative="1">
+      <w:start w:val="1"/>
+      <w:numFmt w:val="bullet"/>
+      <w:lvlText w:val=""/>
+      <w:lvlJc w:val="left"/>
+      <w:pPr>
+        <w:tabs>
+          <w:tab w:val="num" w:pos="5040"/>
+        </w:tabs>
+        <w:ind w:left="5040" w:hanging="360"/>
+      </w:pPr>
+      <w:rPr>
+        <w:rFonts w:ascii="Wingdings" w:hAnsi="Wingdings" w:hint="default"/>
+        <w:sz w:val="20"/>
+      </w:rPr>
+    </w:lvl>
+    <w:lvl w:ilvl="7" w:tentative="1">
+      <w:start w:val="1"/>
+      <w:numFmt w:val="bullet"/>
+      <w:lvlText w:val=""/>
+      <w:lvlJc w:val="left"/>
+      <w:pPr>
+        <w:tabs>
+          <w:tab w:val="num" w:pos="5760"/>
+        </w:tabs>
+        <w:ind w:left="5760" w:hanging="360"/>
+      </w:pPr>
+      <w:rPr>
+        <w:rFonts w:ascii="Wingdings" w:hAnsi="Wingdings" w:hint="default"/>
+        <w:sz w:val="20"/>
+      </w:rPr>
+    </w:lvl>
+    <w:lvl w:ilvl="8" w:tentative="1">
+      <w:start w:val="1"/>
+      <w:numFmt w:val="bullet"/>
+      <w:lvlText w:val=""/>
+      <w:lvlJc w:val="left"/>
+      <w:pPr>
+        <w:tabs>
+          <w:tab w:val="num" w:pos="6480"/>
+        </w:tabs>
+        <w:ind w:left="6480" w:hanging="360"/>
+      </w:pPr>
+      <w:rPr>
+        <w:rFonts w:ascii="Wingdings" w:hAnsi="Wingdings" w:hint="default"/>
+        <w:sz w:val="20"/>
+      </w:rPr>
+    </w:lvl>
+  </w:abstractNum>
+  <w:abstractNum w:abstractNumId="10" w15:restartNumberingAfterBreak="0">
+    <w:nsid w:val="344A3A9A"/>
+    <w:multiLevelType w:val="multilevel"/>
+    <w:tmpl w:val="AB788B22"/>
+    <w:lvl w:ilvl="0">
+      <w:start w:val="1"/>
+      <w:numFmt w:val="bullet"/>
+      <w:lvlText w:val=""/>
+      <w:lvlJc w:val="left"/>
+      <w:pPr>
+        <w:tabs>
+          <w:tab w:val="num" w:pos="720"/>
+        </w:tabs>
+        <w:ind w:left="720" w:hanging="360"/>
+      </w:pPr>
+      <w:rPr>
+        <w:rFonts w:ascii="Symbol" w:hAnsi="Symbol" w:hint="default"/>
+        <w:sz w:val="20"/>
+      </w:rPr>
+    </w:lvl>
+    <w:lvl w:ilvl="1" w:tentative="1">
+      <w:start w:val="1"/>
+      <w:numFmt w:val="bullet"/>
+      <w:lvlText w:val="o"/>
+      <w:lvlJc w:val="left"/>
+      <w:pPr>
+        <w:tabs>
+          <w:tab w:val="num" w:pos="1440"/>
+        </w:tabs>
+        <w:ind w:left="1440" w:hanging="360"/>
+      </w:pPr>
+      <w:rPr>
+        <w:rFonts w:ascii="Courier New" w:hAnsi="Courier New" w:hint="default"/>
+        <w:sz w:val="20"/>
+      </w:rPr>
+    </w:lvl>
+    <w:lvl w:ilvl="2" w:tentative="1">
+      <w:start w:val="1"/>
+      <w:numFmt w:val="bullet"/>
+      <w:lvlText w:val=""/>
+      <w:lvlJc w:val="left"/>
+      <w:pPr>
+        <w:tabs>
+          <w:tab w:val="num" w:pos="2160"/>
+        </w:tabs>
+        <w:ind w:left="2160" w:hanging="360"/>
+      </w:pPr>
+      <w:rPr>
+        <w:rFonts w:ascii="Wingdings" w:hAnsi="Wingdings" w:hint="default"/>
+        <w:sz w:val="20"/>
+      </w:rPr>
+    </w:lvl>
+    <w:lvl w:ilvl="3" w:tentative="1">
+      <w:start w:val="1"/>
+      <w:numFmt w:val="bullet"/>
+      <w:lvlText w:val=""/>
+      <w:lvlJc w:val="left"/>
+      <w:pPr>
+        <w:tabs>
+          <w:tab w:val="num" w:pos="2880"/>
+        </w:tabs>
+        <w:ind w:left="2880" w:hanging="360"/>
+      </w:pPr>
+      <w:rPr>
+        <w:rFonts w:ascii="Wingdings" w:hAnsi="Wingdings" w:hint="default"/>
+        <w:sz w:val="20"/>
+      </w:rPr>
+    </w:lvl>
+    <w:lvl w:ilvl="4" w:tentative="1">
+      <w:start w:val="1"/>
+      <w:numFmt w:val="bullet"/>
+      <w:lvlText w:val=""/>
+      <w:lvlJc w:val="left"/>
+      <w:pPr>
+        <w:tabs>
+          <w:tab w:val="num" w:pos="3600"/>
+        </w:tabs>
+        <w:ind w:left="3600" w:hanging="360"/>
+      </w:pPr>
+      <w:rPr>
+        <w:rFonts w:ascii="Wingdings" w:hAnsi="Wingdings" w:hint="default"/>
+        <w:sz w:val="20"/>
+      </w:rPr>
+    </w:lvl>
+    <w:lvl w:ilvl="5" w:tentative="1">
+      <w:start w:val="1"/>
+      <w:numFmt w:val="bullet"/>
+      <w:lvlText w:val=""/>
+      <w:lvlJc w:val="left"/>
+      <w:pPr>
+        <w:tabs>
+          <w:tab w:val="num" w:pos="4320"/>
+        </w:tabs>
+        <w:ind w:left="4320" w:hanging="360"/>
+      </w:pPr>
+      <w:rPr>
+        <w:rFonts w:ascii="Wingdings" w:hAnsi="Wingdings" w:hint="default"/>
+        <w:sz w:val="20"/>
+      </w:rPr>
+    </w:lvl>
+    <w:lvl w:ilvl="6" w:tentative="1">
+      <w:start w:val="1"/>
+      <w:numFmt w:val="bullet"/>
+      <w:lvlText w:val=""/>
+      <w:lvlJc w:val="left"/>
+      <w:pPr>
+        <w:tabs>
+          <w:tab w:val="num" w:pos="5040"/>
+        </w:tabs>
+        <w:ind w:left="5040" w:hanging="360"/>
+      </w:pPr>
+      <w:rPr>
+        <w:rFonts w:ascii="Wingdings" w:hAnsi="Wingdings" w:hint="default"/>
+        <w:sz w:val="20"/>
+      </w:rPr>
+    </w:lvl>
+    <w:lvl w:ilvl="7" w:tentative="1">
+      <w:start w:val="1"/>
+      <w:numFmt w:val="bullet"/>
+      <w:lvlText w:val=""/>
+      <w:lvlJc w:val="left"/>
+      <w:pPr>
+        <w:tabs>
+          <w:tab w:val="num" w:pos="5760"/>
+        </w:tabs>
+        <w:ind w:left="5760" w:hanging="360"/>
+      </w:pPr>
+      <w:rPr>
+        <w:rFonts w:ascii="Wingdings" w:hAnsi="Wingdings" w:hint="default"/>
+        <w:sz w:val="20"/>
+      </w:rPr>
+    </w:lvl>
+    <w:lvl w:ilvl="8" w:tentative="1">
+      <w:start w:val="1"/>
+      <w:numFmt w:val="bullet"/>
+      <w:lvlText w:val=""/>
+      <w:lvlJc w:val="left"/>
+      <w:pPr>
+        <w:tabs>
+          <w:tab w:val="num" w:pos="6480"/>
+        </w:tabs>
+        <w:ind w:left="6480" w:hanging="360"/>
+      </w:pPr>
+      <w:rPr>
+        <w:rFonts w:ascii="Wingdings" w:hAnsi="Wingdings" w:hint="default"/>
+        <w:sz w:val="20"/>
+      </w:rPr>
+    </w:lvl>
+  </w:abstractNum>
+  <w:abstractNum w:abstractNumId="11" w15:restartNumberingAfterBreak="0">
+    <w:nsid w:val="43123EE0"/>
+    <w:multiLevelType w:val="multilevel"/>
+    <w:tmpl w:val="C5F25DF4"/>
+    <w:lvl w:ilvl="0">
+      <w:start w:val="1"/>
+      <w:numFmt w:val="bullet"/>
+      <w:lvlText w:val=""/>
+      <w:lvlJc w:val="left"/>
+      <w:pPr>
+        <w:tabs>
+          <w:tab w:val="num" w:pos="720"/>
+        </w:tabs>
+        <w:ind w:left="720" w:hanging="360"/>
+      </w:pPr>
+      <w:rPr>
+        <w:rFonts w:ascii="Symbol" w:hAnsi="Symbol" w:hint="default"/>
+        <w:sz w:val="20"/>
+      </w:rPr>
+    </w:lvl>
+    <w:lvl w:ilvl="1">
+      <w:start w:val="1"/>
+      <w:numFmt w:val="bullet"/>
+      <w:lvlText w:val="o"/>
+      <w:lvlJc w:val="left"/>
+      <w:pPr>
+        <w:tabs>
+          <w:tab w:val="num" w:pos="1440"/>
+        </w:tabs>
+        <w:ind w:left="1440" w:hanging="360"/>
+      </w:pPr>
+      <w:rPr>
+        <w:rFonts w:ascii="Courier New" w:hAnsi="Courier New" w:hint="default"/>
+        <w:sz w:val="20"/>
+      </w:rPr>
+    </w:lvl>
+    <w:lvl w:ilvl="2" w:tentative="1">
+      <w:start w:val="1"/>
+      <w:numFmt w:val="bullet"/>
+      <w:lvlText w:val=""/>
+      <w:lvlJc w:val="left"/>
+      <w:pPr>
+        <w:tabs>
+          <w:tab w:val="num" w:pos="2160"/>
+        </w:tabs>
+        <w:ind w:left="2160" w:hanging="360"/>
+      </w:pPr>
+      <w:rPr>
+        <w:rFonts w:ascii="Wingdings" w:hAnsi="Wingdings" w:hint="default"/>
+        <w:sz w:val="20"/>
+      </w:rPr>
+    </w:lvl>
+    <w:lvl w:ilvl="3" w:tentative="1">
+      <w:start w:val="1"/>
+      <w:numFmt w:val="bullet"/>
+      <w:lvlText w:val=""/>
+      <w:lvlJc w:val="left"/>
+      <w:pPr>
+        <w:tabs>
+          <w:tab w:val="num" w:pos="2880"/>
+        </w:tabs>
+        <w:ind w:left="2880" w:hanging="360"/>
+      </w:pPr>
+      <w:rPr>
+        <w:rFonts w:ascii="Wingdings" w:hAnsi="Wingdings" w:hint="default"/>
+        <w:sz w:val="20"/>
+      </w:rPr>
+    </w:lvl>
+    <w:lvl w:ilvl="4" w:tentative="1">
+      <w:start w:val="1"/>
+      <w:numFmt w:val="bullet"/>
+      <w:lvlText w:val=""/>
+      <w:lvlJc w:val="left"/>
+      <w:pPr>
+        <w:tabs>
+          <w:tab w:val="num" w:pos="3600"/>
+        </w:tabs>
+        <w:ind w:left="3600" w:hanging="360"/>
+      </w:pPr>
+      <w:rPr>
+        <w:rFonts w:ascii="Wingdings" w:hAnsi="Wingdings" w:hint="default"/>
+        <w:sz w:val="20"/>
+      </w:rPr>
+    </w:lvl>
+    <w:lvl w:ilvl="5" w:tentative="1">
+      <w:start w:val="1"/>
+      <w:numFmt w:val="bullet"/>
+      <w:lvlText w:val=""/>
+      <w:lvlJc w:val="left"/>
+      <w:pPr>
+        <w:tabs>
+          <w:tab w:val="num" w:pos="4320"/>
+        </w:tabs>
+        <w:ind w:left="4320" w:hanging="360"/>
+      </w:pPr>
+      <w:rPr>
+        <w:rFonts w:ascii="Wingdings" w:hAnsi="Wingdings" w:hint="default"/>
+        <w:sz w:val="20"/>
+      </w:rPr>
+    </w:lvl>
+    <w:lvl w:ilvl="6" w:tentative="1">
+      <w:start w:val="1"/>
+      <w:numFmt w:val="bullet"/>
+      <w:lvlText w:val=""/>
+      <w:lvlJc w:val="left"/>
+      <w:pPr>
+        <w:tabs>
+          <w:tab w:val="num" w:pos="5040"/>
+        </w:tabs>
+        <w:ind w:left="5040" w:hanging="360"/>
+      </w:pPr>
+      <w:rPr>
+        <w:rFonts w:ascii="Wingdings" w:hAnsi="Wingdings" w:hint="default"/>
+        <w:sz w:val="20"/>
+      </w:rPr>
+    </w:lvl>
+    <w:lvl w:ilvl="7" w:tentative="1">
+      <w:start w:val="1"/>
+      <w:numFmt w:val="bullet"/>
+      <w:lvlText w:val=""/>
+      <w:lvlJc w:val="left"/>
+      <w:pPr>
+        <w:tabs>
+          <w:tab w:val="num" w:pos="5760"/>
+        </w:tabs>
+        <w:ind w:left="5760" w:hanging="360"/>
+      </w:pPr>
+      <w:rPr>
+        <w:rFonts w:ascii="Wingdings" w:hAnsi="Wingdings" w:hint="default"/>
+        <w:sz w:val="20"/>
+      </w:rPr>
+    </w:lvl>
+    <w:lvl w:ilvl="8" w:tentative="1">
+      <w:start w:val="1"/>
+      <w:numFmt w:val="bullet"/>
+      <w:lvlText w:val=""/>
+      <w:lvlJc w:val="left"/>
+      <w:pPr>
+        <w:tabs>
+          <w:tab w:val="num" w:pos="6480"/>
+        </w:tabs>
+        <w:ind w:left="6480" w:hanging="360"/>
+      </w:pPr>
+      <w:rPr>
+        <w:rFonts w:ascii="Wingdings" w:hAnsi="Wingdings" w:hint="default"/>
+        <w:sz w:val="20"/>
+      </w:rPr>
+    </w:lvl>
+  </w:abstractNum>
+  <w:abstractNum w:abstractNumId="12" w15:restartNumberingAfterBreak="0">
+    <w:nsid w:val="45AE767E"/>
+    <w:multiLevelType w:val="multilevel"/>
+    <w:tmpl w:val="0A2EEBDE"/>
+    <w:lvl w:ilvl="0">
+      <w:start w:val="1"/>
+      <w:numFmt w:val="bullet"/>
+      <w:lvlText w:val=""/>
+      <w:lvlJc w:val="left"/>
+      <w:pPr>
+        <w:tabs>
+          <w:tab w:val="num" w:pos="720"/>
+        </w:tabs>
+        <w:ind w:left="720" w:hanging="360"/>
+      </w:pPr>
+      <w:rPr>
+        <w:rFonts w:ascii="Symbol" w:hAnsi="Symbol" w:hint="default"/>
+        <w:sz w:val="20"/>
+      </w:rPr>
+    </w:lvl>
+    <w:lvl w:ilvl="1" w:tentative="1">
+      <w:start w:val="1"/>
+      <w:numFmt w:val="bullet"/>
+      <w:lvlText w:val="o"/>
+      <w:lvlJc w:val="left"/>
+      <w:pPr>
+        <w:tabs>
+          <w:tab w:val="num" w:pos="1440"/>
+        </w:tabs>
+        <w:ind w:left="1440" w:hanging="360"/>
+      </w:pPr>
+      <w:rPr>
+        <w:rFonts w:ascii="Courier New" w:hAnsi="Courier New" w:hint="default"/>
+        <w:sz w:val="20"/>
+      </w:rPr>
+    </w:lvl>
+    <w:lvl w:ilvl="2" w:tentative="1">
+      <w:start w:val="1"/>
+      <w:numFmt w:val="bullet"/>
+      <w:lvlText w:val=""/>
+      <w:lvlJc w:val="left"/>
+      <w:pPr>
+        <w:tabs>
+          <w:tab w:val="num" w:pos="2160"/>
+        </w:tabs>
+        <w:ind w:left="2160" w:hanging="360"/>
+      </w:pPr>
+      <w:rPr>
+        <w:rFonts w:ascii="Wingdings" w:hAnsi="Wingdings" w:hint="default"/>
+        <w:sz w:val="20"/>
+      </w:rPr>
+    </w:lvl>
+    <w:lvl w:ilvl="3" w:tentative="1">
+      <w:start w:val="1"/>
+      <w:numFmt w:val="bullet"/>
+      <w:lvlText w:val=""/>
+      <w:lvlJc w:val="left"/>
+      <w:pPr>
+        <w:tabs>
+          <w:tab w:val="num" w:pos="2880"/>
+        </w:tabs>
+        <w:ind w:left="2880" w:hanging="360"/>
+      </w:pPr>
+      <w:rPr>
+        <w:rFonts w:ascii="Wingdings" w:hAnsi="Wingdings" w:hint="default"/>
+        <w:sz w:val="20"/>
+      </w:rPr>
+    </w:lvl>
+    <w:lvl w:ilvl="4" w:tentative="1">
+      <w:start w:val="1"/>
+      <w:numFmt w:val="bullet"/>
+      <w:lvlText w:val=""/>
+      <w:lvlJc w:val="left"/>
+      <w:pPr>
+        <w:tabs>
+          <w:tab w:val="num" w:pos="3600"/>
+        </w:tabs>
+        <w:ind w:left="3600" w:hanging="360"/>
+      </w:pPr>
+      <w:rPr>
+        <w:rFonts w:ascii="Wingdings" w:hAnsi="Wingdings" w:hint="default"/>
+        <w:sz w:val="20"/>
+      </w:rPr>
+    </w:lvl>
+    <w:lvl w:ilvl="5" w:tentative="1">
+      <w:start w:val="1"/>
+      <w:numFmt w:val="bullet"/>
+      <w:lvlText w:val=""/>
+      <w:lvlJc w:val="left"/>
+      <w:pPr>
+        <w:tabs>
+          <w:tab w:val="num" w:pos="4320"/>
+        </w:tabs>
+        <w:ind w:left="4320" w:hanging="360"/>
+      </w:pPr>
+      <w:rPr>
+        <w:rFonts w:ascii="Wingdings" w:hAnsi="Wingdings" w:hint="default"/>
+        <w:sz w:val="20"/>
+      </w:rPr>
+    </w:lvl>
+    <w:lvl w:ilvl="6" w:tentative="1">
+      <w:start w:val="1"/>
+      <w:numFmt w:val="bullet"/>
+      <w:lvlText w:val=""/>
+      <w:lvlJc w:val="left"/>
+      <w:pPr>
+        <w:tabs>
+          <w:tab w:val="num" w:pos="5040"/>
+        </w:tabs>
+        <w:ind w:left="5040" w:hanging="360"/>
+      </w:pPr>
+      <w:rPr>
+        <w:rFonts w:ascii="Wingdings" w:hAnsi="Wingdings" w:hint="default"/>
+        <w:sz w:val="20"/>
+      </w:rPr>
+    </w:lvl>
+    <w:lvl w:ilvl="7" w:tentative="1">
+      <w:start w:val="1"/>
+      <w:numFmt w:val="bullet"/>
+      <w:lvlText w:val=""/>
+      <w:lvlJc w:val="left"/>
+      <w:pPr>
+        <w:tabs>
+          <w:tab w:val="num" w:pos="5760"/>
+        </w:tabs>
+        <w:ind w:left="5760" w:hanging="360"/>
+      </w:pPr>
+      <w:rPr>
+        <w:rFonts w:ascii="Wingdings" w:hAnsi="Wingdings" w:hint="default"/>
+        <w:sz w:val="20"/>
+      </w:rPr>
+    </w:lvl>
+    <w:lvl w:ilvl="8" w:tentative="1">
+      <w:start w:val="1"/>
+      <w:numFmt w:val="bullet"/>
+      <w:lvlText w:val=""/>
+      <w:lvlJc w:val="left"/>
+      <w:pPr>
+        <w:tabs>
+          <w:tab w:val="num" w:pos="6480"/>
+        </w:tabs>
+        <w:ind w:left="6480" w:hanging="360"/>
+      </w:pPr>
+      <w:rPr>
+        <w:rFonts w:ascii="Wingdings" w:hAnsi="Wingdings" w:hint="default"/>
+        <w:sz w:val="20"/>
+      </w:rPr>
+    </w:lvl>
+  </w:abstractNum>
+  <w:abstractNum w:abstractNumId="13" w15:restartNumberingAfterBreak="0">
     <w:nsid w:val="4EA552BE"/>
     <w:multiLevelType w:val="multilevel"/>
     <w:tmpl w:val="03EE15D8"/>
@@ -2293,7 +5033,7 @@
       </w:rPr>
     </w:lvl>
   </w:abstractNum>
-  <w:abstractNum w:abstractNumId="8" w15:restartNumberingAfterBreak="0">
+  <w:abstractNum w:abstractNumId="14" w15:restartNumberingAfterBreak="0">
     <w:nsid w:val="4EDC1C0F"/>
     <w:multiLevelType w:val="multilevel"/>
     <w:tmpl w:val="59FC8386"/>
@@ -2496,7 +5236,7 @@
       </w:rPr>
     </w:lvl>
   </w:abstractNum>
-  <w:abstractNum w:abstractNumId="9" w15:restartNumberingAfterBreak="0">
+  <w:abstractNum w:abstractNumId="15" w15:restartNumberingAfterBreak="0">
     <w:nsid w:val="5015031D"/>
     <w:multiLevelType w:val="multilevel"/>
     <w:tmpl w:val="1C80C9F0"/>
@@ -2699,7 +5439,7 @@
       </w:rPr>
     </w:lvl>
   </w:abstractNum>
-  <w:abstractNum w:abstractNumId="10" w15:restartNumberingAfterBreak="0">
+  <w:abstractNum w:abstractNumId="16" w15:restartNumberingAfterBreak="0">
     <w:nsid w:val="542F5F48"/>
     <w:multiLevelType w:val="multilevel"/>
     <w:tmpl w:val="28FCA06A"/>
@@ -2848,7 +5588,7 @@
       </w:rPr>
     </w:lvl>
   </w:abstractNum>
-  <w:abstractNum w:abstractNumId="11" w15:restartNumberingAfterBreak="0">
+  <w:abstractNum w:abstractNumId="17" w15:restartNumberingAfterBreak="0">
     <w:nsid w:val="57714DD5"/>
     <w:multiLevelType w:val="multilevel"/>
     <w:tmpl w:val="746E40AE"/>
@@ -2965,7 +5705,7 @@
       </w:pPr>
     </w:lvl>
   </w:abstractNum>
-  <w:abstractNum w:abstractNumId="12" w15:restartNumberingAfterBreak="0">
+  <w:abstractNum w:abstractNumId="18" w15:restartNumberingAfterBreak="0">
     <w:nsid w:val="63062461"/>
     <w:multiLevelType w:val="multilevel"/>
     <w:tmpl w:val="B35C47AA"/>
@@ -3114,7 +5854,7 @@
       </w:rPr>
     </w:lvl>
   </w:abstractNum>
-  <w:abstractNum w:abstractNumId="13" w15:restartNumberingAfterBreak="0">
+  <w:abstractNum w:abstractNumId="19" w15:restartNumberingAfterBreak="0">
     <w:nsid w:val="64BC48A8"/>
     <w:multiLevelType w:val="multilevel"/>
     <w:tmpl w:val="278800DA"/>
@@ -3263,7 +6003,7 @@
       </w:rPr>
     </w:lvl>
   </w:abstractNum>
-  <w:abstractNum w:abstractNumId="14" w15:restartNumberingAfterBreak="0">
+  <w:abstractNum w:abstractNumId="20" w15:restartNumberingAfterBreak="0">
     <w:nsid w:val="65B822F6"/>
     <w:multiLevelType w:val="multilevel"/>
     <w:tmpl w:val="C226AD78"/>
@@ -3466,7 +6206,7 @@
       </w:rPr>
     </w:lvl>
   </w:abstractNum>
-  <w:abstractNum w:abstractNumId="15" w15:restartNumberingAfterBreak="0">
+  <w:abstractNum w:abstractNumId="21" w15:restartNumberingAfterBreak="0">
     <w:nsid w:val="67C2448C"/>
     <w:multiLevelType w:val="multilevel"/>
     <w:tmpl w:val="FFCA96C0"/>
@@ -3612,6 +6352,267 @@
       <w:rPr>
         <w:rFonts w:ascii="Wingdings" w:hAnsi="Wingdings" w:hint="default"/>
         <w:sz w:val="20"/>
+      </w:rPr>
+    </w:lvl>
+  </w:abstractNum>
+  <w:abstractNum w:abstractNumId="22" w15:restartNumberingAfterBreak="0">
+    <w:nsid w:val="7DBF5613"/>
+    <w:multiLevelType w:val="multilevel"/>
+    <w:tmpl w:val="B7721F3E"/>
+    <w:lvl w:ilvl="0">
+      <w:start w:val="1"/>
+      <w:numFmt w:val="bullet"/>
+      <w:lvlText w:val=""/>
+      <w:lvlJc w:val="left"/>
+      <w:pPr>
+        <w:tabs>
+          <w:tab w:val="num" w:pos="720"/>
+        </w:tabs>
+        <w:ind w:left="720" w:hanging="360"/>
+      </w:pPr>
+      <w:rPr>
+        <w:rFonts w:ascii="Symbol" w:hAnsi="Symbol" w:hint="default"/>
+        <w:sz w:val="20"/>
+      </w:rPr>
+    </w:lvl>
+    <w:lvl w:ilvl="1">
+      <w:start w:val="1"/>
+      <w:numFmt w:val="bullet"/>
+      <w:lvlText w:val="o"/>
+      <w:lvlJc w:val="left"/>
+      <w:pPr>
+        <w:tabs>
+          <w:tab w:val="num" w:pos="1440"/>
+        </w:tabs>
+        <w:ind w:left="1440" w:hanging="360"/>
+      </w:pPr>
+      <w:rPr>
+        <w:rFonts w:ascii="Courier New" w:hAnsi="Courier New" w:hint="default"/>
+        <w:sz w:val="20"/>
+      </w:rPr>
+    </w:lvl>
+    <w:lvl w:ilvl="2" w:tentative="1">
+      <w:start w:val="1"/>
+      <w:numFmt w:val="bullet"/>
+      <w:lvlText w:val=""/>
+      <w:lvlJc w:val="left"/>
+      <w:pPr>
+        <w:tabs>
+          <w:tab w:val="num" w:pos="2160"/>
+        </w:tabs>
+        <w:ind w:left="2160" w:hanging="360"/>
+      </w:pPr>
+      <w:rPr>
+        <w:rFonts w:ascii="Wingdings" w:hAnsi="Wingdings" w:hint="default"/>
+        <w:sz w:val="20"/>
+      </w:rPr>
+    </w:lvl>
+    <w:lvl w:ilvl="3" w:tentative="1">
+      <w:start w:val="1"/>
+      <w:numFmt w:val="bullet"/>
+      <w:lvlText w:val=""/>
+      <w:lvlJc w:val="left"/>
+      <w:pPr>
+        <w:tabs>
+          <w:tab w:val="num" w:pos="2880"/>
+        </w:tabs>
+        <w:ind w:left="2880" w:hanging="360"/>
+      </w:pPr>
+      <w:rPr>
+        <w:rFonts w:ascii="Wingdings" w:hAnsi="Wingdings" w:hint="default"/>
+        <w:sz w:val="20"/>
+      </w:rPr>
+    </w:lvl>
+    <w:lvl w:ilvl="4" w:tentative="1">
+      <w:start w:val="1"/>
+      <w:numFmt w:val="bullet"/>
+      <w:lvlText w:val=""/>
+      <w:lvlJc w:val="left"/>
+      <w:pPr>
+        <w:tabs>
+          <w:tab w:val="num" w:pos="3600"/>
+        </w:tabs>
+        <w:ind w:left="3600" w:hanging="360"/>
+      </w:pPr>
+      <w:rPr>
+        <w:rFonts w:ascii="Wingdings" w:hAnsi="Wingdings" w:hint="default"/>
+        <w:sz w:val="20"/>
+      </w:rPr>
+    </w:lvl>
+    <w:lvl w:ilvl="5" w:tentative="1">
+      <w:start w:val="1"/>
+      <w:numFmt w:val="bullet"/>
+      <w:lvlText w:val=""/>
+      <w:lvlJc w:val="left"/>
+      <w:pPr>
+        <w:tabs>
+          <w:tab w:val="num" w:pos="4320"/>
+        </w:tabs>
+        <w:ind w:left="4320" w:hanging="360"/>
+      </w:pPr>
+      <w:rPr>
+        <w:rFonts w:ascii="Wingdings" w:hAnsi="Wingdings" w:hint="default"/>
+        <w:sz w:val="20"/>
+      </w:rPr>
+    </w:lvl>
+    <w:lvl w:ilvl="6" w:tentative="1">
+      <w:start w:val="1"/>
+      <w:numFmt w:val="bullet"/>
+      <w:lvlText w:val=""/>
+      <w:lvlJc w:val="left"/>
+      <w:pPr>
+        <w:tabs>
+          <w:tab w:val="num" w:pos="5040"/>
+        </w:tabs>
+        <w:ind w:left="5040" w:hanging="360"/>
+      </w:pPr>
+      <w:rPr>
+        <w:rFonts w:ascii="Wingdings" w:hAnsi="Wingdings" w:hint="default"/>
+        <w:sz w:val="20"/>
+      </w:rPr>
+    </w:lvl>
+    <w:lvl w:ilvl="7" w:tentative="1">
+      <w:start w:val="1"/>
+      <w:numFmt w:val="bullet"/>
+      <w:lvlText w:val=""/>
+      <w:lvlJc w:val="left"/>
+      <w:pPr>
+        <w:tabs>
+          <w:tab w:val="num" w:pos="5760"/>
+        </w:tabs>
+        <w:ind w:left="5760" w:hanging="360"/>
+      </w:pPr>
+      <w:rPr>
+        <w:rFonts w:ascii="Wingdings" w:hAnsi="Wingdings" w:hint="default"/>
+        <w:sz w:val="20"/>
+      </w:rPr>
+    </w:lvl>
+    <w:lvl w:ilvl="8" w:tentative="1">
+      <w:start w:val="1"/>
+      <w:numFmt w:val="bullet"/>
+      <w:lvlText w:val=""/>
+      <w:lvlJc w:val="left"/>
+      <w:pPr>
+        <w:tabs>
+          <w:tab w:val="num" w:pos="6480"/>
+        </w:tabs>
+        <w:ind w:left="6480" w:hanging="360"/>
+      </w:pPr>
+      <w:rPr>
+        <w:rFonts w:ascii="Wingdings" w:hAnsi="Wingdings" w:hint="default"/>
+        <w:sz w:val="20"/>
+      </w:rPr>
+    </w:lvl>
+  </w:abstractNum>
+  <w:abstractNum w:abstractNumId="23" w15:restartNumberingAfterBreak="0">
+    <w:nsid w:val="7FAF26EF"/>
+    <w:multiLevelType w:val="hybridMultilevel"/>
+    <w:tmpl w:val="F5A0A95E"/>
+    <w:lvl w:ilvl="0" w:tplc="6AD4B750">
+      <w:numFmt w:val="bullet"/>
+      <w:lvlText w:val="-"/>
+      <w:lvlJc w:val="left"/>
+      <w:pPr>
+        <w:ind w:left="720" w:hanging="360"/>
+      </w:pPr>
+      <w:rPr>
+        <w:rFonts w:ascii="Google Sans" w:eastAsia="Google Sans" w:hAnsi="Google Sans" w:cs="Google Sans" w:hint="default"/>
+      </w:rPr>
+    </w:lvl>
+    <w:lvl w:ilvl="1" w:tplc="08090003" w:tentative="1">
+      <w:start w:val="1"/>
+      <w:numFmt w:val="bullet"/>
+      <w:lvlText w:val="o"/>
+      <w:lvlJc w:val="left"/>
+      <w:pPr>
+        <w:ind w:left="1440" w:hanging="360"/>
+      </w:pPr>
+      <w:rPr>
+        <w:rFonts w:ascii="Courier New" w:hAnsi="Courier New" w:hint="default"/>
+      </w:rPr>
+    </w:lvl>
+    <w:lvl w:ilvl="2" w:tplc="08090005" w:tentative="1">
+      <w:start w:val="1"/>
+      <w:numFmt w:val="bullet"/>
+      <w:lvlText w:val=""/>
+      <w:lvlJc w:val="left"/>
+      <w:pPr>
+        <w:ind w:left="2160" w:hanging="360"/>
+      </w:pPr>
+      <w:rPr>
+        <w:rFonts w:ascii="Wingdings" w:hAnsi="Wingdings" w:hint="default"/>
+      </w:rPr>
+    </w:lvl>
+    <w:lvl w:ilvl="3" w:tplc="08090001" w:tentative="1">
+      <w:start w:val="1"/>
+      <w:numFmt w:val="bullet"/>
+      <w:lvlText w:val=""/>
+      <w:lvlJc w:val="left"/>
+      <w:pPr>
+        <w:ind w:left="2880" w:hanging="360"/>
+      </w:pPr>
+      <w:rPr>
+        <w:rFonts w:ascii="Symbol" w:hAnsi="Symbol" w:hint="default"/>
+      </w:rPr>
+    </w:lvl>
+    <w:lvl w:ilvl="4" w:tplc="08090003" w:tentative="1">
+      <w:start w:val="1"/>
+      <w:numFmt w:val="bullet"/>
+      <w:lvlText w:val="o"/>
+      <w:lvlJc w:val="left"/>
+      <w:pPr>
+        <w:ind w:left="3600" w:hanging="360"/>
+      </w:pPr>
+      <w:rPr>
+        <w:rFonts w:ascii="Courier New" w:hAnsi="Courier New" w:hint="default"/>
+      </w:rPr>
+    </w:lvl>
+    <w:lvl w:ilvl="5" w:tplc="08090005" w:tentative="1">
+      <w:start w:val="1"/>
+      <w:numFmt w:val="bullet"/>
+      <w:lvlText w:val=""/>
+      <w:lvlJc w:val="left"/>
+      <w:pPr>
+        <w:ind w:left="4320" w:hanging="360"/>
+      </w:pPr>
+      <w:rPr>
+        <w:rFonts w:ascii="Wingdings" w:hAnsi="Wingdings" w:hint="default"/>
+      </w:rPr>
+    </w:lvl>
+    <w:lvl w:ilvl="6" w:tplc="08090001" w:tentative="1">
+      <w:start w:val="1"/>
+      <w:numFmt w:val="bullet"/>
+      <w:lvlText w:val=""/>
+      <w:lvlJc w:val="left"/>
+      <w:pPr>
+        <w:ind w:left="5040" w:hanging="360"/>
+      </w:pPr>
+      <w:rPr>
+        <w:rFonts w:ascii="Symbol" w:hAnsi="Symbol" w:hint="default"/>
+      </w:rPr>
+    </w:lvl>
+    <w:lvl w:ilvl="7" w:tplc="08090003" w:tentative="1">
+      <w:start w:val="1"/>
+      <w:numFmt w:val="bullet"/>
+      <w:lvlText w:val="o"/>
+      <w:lvlJc w:val="left"/>
+      <w:pPr>
+        <w:ind w:left="5760" w:hanging="360"/>
+      </w:pPr>
+      <w:rPr>
+        <w:rFonts w:ascii="Courier New" w:hAnsi="Courier New" w:hint="default"/>
+      </w:rPr>
+    </w:lvl>
+    <w:lvl w:ilvl="8" w:tplc="08090005" w:tentative="1">
+      <w:start w:val="1"/>
+      <w:numFmt w:val="bullet"/>
+      <w:lvlText w:val=""/>
+      <w:lvlJc w:val="left"/>
+      <w:pPr>
+        <w:ind w:left="6480" w:hanging="360"/>
+      </w:pPr>
+      <w:rPr>
+        <w:rFonts w:ascii="Wingdings" w:hAnsi="Wingdings" w:hint="default"/>
       </w:rPr>
     </w:lvl>
   </w:abstractNum>
@@ -3622,10 +6623,10 @@
     <w:abstractNumId w:val="6"/>
   </w:num>
   <w:num w:numId="3" w16cid:durableId="851988684">
-    <w:abstractNumId w:val="8"/>
+    <w:abstractNumId w:val="14"/>
   </w:num>
   <w:num w:numId="4" w16cid:durableId="701054275">
-    <w:abstractNumId w:val="9"/>
+    <w:abstractNumId w:val="15"/>
   </w:num>
   <w:num w:numId="5" w16cid:durableId="683558297">
     <w:abstractNumId w:val="3"/>
@@ -3634,34 +6635,58 @@
     <w:abstractNumId w:val="0"/>
   </w:num>
   <w:num w:numId="7" w16cid:durableId="828517832">
-    <w:abstractNumId w:val="7"/>
+    <w:abstractNumId w:val="13"/>
   </w:num>
   <w:num w:numId="8" w16cid:durableId="1027097777">
-    <w:abstractNumId w:val="14"/>
+    <w:abstractNumId w:val="20"/>
   </w:num>
   <w:num w:numId="9" w16cid:durableId="1479952956">
-    <w:abstractNumId w:val="10"/>
+    <w:abstractNumId w:val="16"/>
   </w:num>
   <w:num w:numId="10" w16cid:durableId="1549995521">
     <w:abstractNumId w:val="1"/>
   </w:num>
   <w:num w:numId="11" w16cid:durableId="381563382">
-    <w:abstractNumId w:val="13"/>
+    <w:abstractNumId w:val="19"/>
   </w:num>
   <w:num w:numId="12" w16cid:durableId="1409960373">
-    <w:abstractNumId w:val="12"/>
+    <w:abstractNumId w:val="18"/>
   </w:num>
   <w:num w:numId="13" w16cid:durableId="1931111801">
-    <w:abstractNumId w:val="11"/>
+    <w:abstractNumId w:val="17"/>
   </w:num>
   <w:num w:numId="14" w16cid:durableId="1501697571">
     <w:abstractNumId w:val="5"/>
   </w:num>
   <w:num w:numId="15" w16cid:durableId="1924414381">
-    <w:abstractNumId w:val="15"/>
+    <w:abstractNumId w:val="21"/>
   </w:num>
   <w:num w:numId="16" w16cid:durableId="443812815">
     <w:abstractNumId w:val="4"/>
+  </w:num>
+  <w:num w:numId="17" w16cid:durableId="2118601759">
+    <w:abstractNumId w:val="10"/>
+  </w:num>
+  <w:num w:numId="18" w16cid:durableId="228393043">
+    <w:abstractNumId w:val="7"/>
+  </w:num>
+  <w:num w:numId="19" w16cid:durableId="1199976845">
+    <w:abstractNumId w:val="23"/>
+  </w:num>
+  <w:num w:numId="20" w16cid:durableId="747382808">
+    <w:abstractNumId w:val="12"/>
+  </w:num>
+  <w:num w:numId="21" w16cid:durableId="1899048540">
+    <w:abstractNumId w:val="11"/>
+  </w:num>
+  <w:num w:numId="22" w16cid:durableId="137692816">
+    <w:abstractNumId w:val="9"/>
+  </w:num>
+  <w:num w:numId="23" w16cid:durableId="1994287682">
+    <w:abstractNumId w:val="22"/>
+  </w:num>
+  <w:num w:numId="24" w16cid:durableId="735518138">
+    <w:abstractNumId w:val="8"/>
   </w:num>
 </w:numbering>
 </file>
@@ -4412,6 +7437,36 @@
     <w:basedOn w:val="DefaultParagraphFont"/>
     <w:rsid w:val="0058739A"/>
   </w:style>
+  <w:style w:type="character" w:customStyle="1" w:styleId="ng-tns-c2709846391-111">
+    <w:name w:val="ng-tns-c2709846391-111"/>
+    <w:basedOn w:val="DefaultParagraphFont"/>
+    <w:rsid w:val="00F43D0A"/>
+  </w:style>
+  <w:style w:type="character" w:customStyle="1" w:styleId="hljs-builtin">
+    <w:name w:val="hljs-built_in"/>
+    <w:basedOn w:val="DefaultParagraphFont"/>
+    <w:rsid w:val="00F43D0A"/>
+  </w:style>
+  <w:style w:type="paragraph" w:styleId="ListParagraph">
+    <w:name w:val="List Paragraph"/>
+    <w:basedOn w:val="Normal"/>
+    <w:uiPriority w:val="34"/>
+    <w:qFormat/>
+    <w:rsid w:val="00F70AFF"/>
+    <w:pPr>
+      <w:ind w:left="720"/>
+      <w:contextualSpacing/>
+    </w:pPr>
+    <w:rPr>
+      <w:rFonts w:cs="Mangal"/>
+      <w:szCs w:val="20"/>
+    </w:rPr>
+  </w:style>
+  <w:style w:type="character" w:customStyle="1" w:styleId="ng-tns-c2709846391-110">
+    <w:name w:val="ng-tns-c2709846391-110"/>
+    <w:basedOn w:val="DefaultParagraphFont"/>
+    <w:rsid w:val="000022FC"/>
+  </w:style>
 </w:styles>
 </file>
 

</xml_diff>